<commit_message>
update report with screenshots
</commit_message>
<xml_diff>
--- a/docs/REPORT.docx
+++ b/docs/REPORT.docx
@@ -1926,84 +1926,339 @@
     </w:p>
     <w:p>
       <w:pPr>
-        <w:jc w:val="left"/>
+        <w:jc w:val="center"/>
       </w:pPr>
       <w:r>
         <w:rPr>
-          <w:b w:val="0"/>
-          <w:i w:val="0"/>
-          <w:sz w:val="21"/>
+          <w:b/>
+          <w:sz w:val="18"/>
         </w:rPr>
-        <w:t>Place in docs/screenshots/:</w:t>
+        <w:t>01-login.png - Login and Auth Menu - shows demo logins and member registration note</w:t>
       </w:r>
     </w:p>
     <w:p>
       <w:pPr>
-        <w:pStyle w:val="ListBullet"/>
+        <w:jc w:val="center"/>
       </w:pPr>
       <w:r>
-        <w:rPr>
-          <w:sz w:val="21"/>
-        </w:rPr>
-        <w:t>Login screen</w:t>
+        <w:drawing>
+          <wp:inline xmlns:a="http://schemas.openxmlformats.org/drawingml/2006/main" xmlns:pic="http://schemas.openxmlformats.org/drawingml/2006/picture">
+            <wp:extent cx="5029200" cy="3612642"/>
+            <wp:docPr id="3" name="Picture 3"/>
+            <wp:cNvGraphicFramePr>
+              <a:graphicFrameLocks noChangeAspect="1"/>
+            </wp:cNvGraphicFramePr>
+            <a:graphic>
+              <a:graphicData uri="http://schemas.openxmlformats.org/drawingml/2006/picture">
+                <pic:pic>
+                  <pic:nvPicPr>
+                    <pic:cNvPr id="0" name="01-login.png"/>
+                    <pic:cNvPicPr/>
+                  </pic:nvPicPr>
+                  <pic:blipFill>
+                    <a:blip r:embed="rId11"/>
+                    <a:stretch>
+                      <a:fillRect/>
+                    </a:stretch>
+                  </pic:blipFill>
+                  <pic:spPr>
+                    <a:xfrm>
+                      <a:off x="0" y="0"/>
+                      <a:ext cx="5029200" cy="3612642"/>
+                    </a:xfrm>
+                    <a:prstGeom prst="rect"/>
+                  </pic:spPr>
+                </pic:pic>
+              </a:graphicData>
+            </a:graphic>
+          </wp:inline>
+        </w:drawing>
       </w:r>
     </w:p>
     <w:p>
       <w:pPr>
-        <w:pStyle w:val="ListBullet"/>
+        <w:spacing w:after="120"/>
+      </w:pPr>
+    </w:p>
+    <w:p>
+      <w:pPr>
+        <w:jc w:val="center"/>
       </w:pPr>
       <w:r>
         <w:rPr>
-          <w:sz w:val="21"/>
+          <w:b/>
+          <w:sz w:val="18"/>
         </w:rPr>
-        <w:t>Admin dashboard</w:t>
+        <w:t>02-admin-dashboard.png - Admin Dashboard - manage books, members, reports</w:t>
       </w:r>
     </w:p>
     <w:p>
       <w:pPr>
-        <w:pStyle w:val="ListBullet"/>
+        <w:jc w:val="center"/>
       </w:pPr>
       <w:r>
-        <w:rPr>
-          <w:sz w:val="21"/>
-        </w:rPr>
-        <w:t>Manage books</w:t>
+        <w:drawing>
+          <wp:inline xmlns:a="http://schemas.openxmlformats.org/drawingml/2006/main" xmlns:pic="http://schemas.openxmlformats.org/drawingml/2006/picture">
+            <wp:extent cx="5029200" cy="1902714"/>
+            <wp:docPr id="4" name="Picture 4"/>
+            <wp:cNvGraphicFramePr>
+              <a:graphicFrameLocks noChangeAspect="1"/>
+            </wp:cNvGraphicFramePr>
+            <a:graphic>
+              <a:graphicData uri="http://schemas.openxmlformats.org/drawingml/2006/picture">
+                <pic:pic>
+                  <pic:nvPicPr>
+                    <pic:cNvPr id="0" name="02-admin-dashboard.png"/>
+                    <pic:cNvPicPr/>
+                  </pic:nvPicPr>
+                  <pic:blipFill>
+                    <a:blip r:embed="rId12"/>
+                    <a:stretch>
+                      <a:fillRect/>
+                    </a:stretch>
+                  </pic:blipFill>
+                  <pic:spPr>
+                    <a:xfrm>
+                      <a:off x="0" y="0"/>
+                      <a:ext cx="5029200" cy="1902714"/>
+                    </a:xfrm>
+                    <a:prstGeom prst="rect"/>
+                  </pic:spPr>
+                </pic:pic>
+              </a:graphicData>
+            </a:graphic>
+          </wp:inline>
+        </w:drawing>
       </w:r>
     </w:p>
     <w:p>
       <w:pPr>
-        <w:pStyle w:val="ListBullet"/>
+        <w:spacing w:after="120"/>
+      </w:pPr>
+    </w:p>
+    <w:p>
+      <w:pPr>
+        <w:jc w:val="center"/>
       </w:pPr>
       <w:r>
         <w:rPr>
-          <w:sz w:val="21"/>
+          <w:b/>
+          <w:sz w:val="18"/>
         </w:rPr>
-        <w:t>Member issue and return</w:t>
+        <w:t>03-manage-books.png - Manage Books - list with Avail/Total, add/search/edit/delete</w:t>
       </w:r>
     </w:p>
     <w:p>
       <w:pPr>
-        <w:pStyle w:val="ListBullet"/>
+        <w:jc w:val="center"/>
       </w:pPr>
       <w:r>
-        <w:rPr>
-          <w:sz w:val="21"/>
-        </w:rPr>
-        <w:t>Reports</w:t>
+        <w:drawing>
+          <wp:inline xmlns:a="http://schemas.openxmlformats.org/drawingml/2006/main" xmlns:pic="http://schemas.openxmlformats.org/drawingml/2006/picture">
+            <wp:extent cx="5029200" cy="2900172"/>
+            <wp:docPr id="5" name="Picture 5"/>
+            <wp:cNvGraphicFramePr>
+              <a:graphicFrameLocks noChangeAspect="1"/>
+            </wp:cNvGraphicFramePr>
+            <a:graphic>
+              <a:graphicData uri="http://schemas.openxmlformats.org/drawingml/2006/picture">
+                <pic:pic>
+                  <pic:nvPicPr>
+                    <pic:cNvPr id="0" name="03-manage-books.png"/>
+                    <pic:cNvPicPr/>
+                  </pic:nvPicPr>
+                  <pic:blipFill>
+                    <a:blip r:embed="rId13"/>
+                    <a:stretch>
+                      <a:fillRect/>
+                    </a:stretch>
+                  </pic:blipFill>
+                  <pic:spPr>
+                    <a:xfrm>
+                      <a:off x="0" y="0"/>
+                      <a:ext cx="5029200" cy="2900172"/>
+                    </a:xfrm>
+                    <a:prstGeom prst="rect"/>
+                  </pic:spPr>
+                </pic:pic>
+              </a:graphicData>
+            </a:graphic>
+          </wp:inline>
+        </w:drawing>
       </w:r>
     </w:p>
     <w:p>
       <w:pPr>
-        <w:jc w:val="left"/>
+        <w:spacing w:after="120"/>
+      </w:pPr>
+    </w:p>
+    <w:p>
+      <w:pPr>
+        <w:jc w:val="center"/>
       </w:pPr>
       <w:r>
         <w:rPr>
-          <w:b w:val="0"/>
-          <w:i/>
+          <w:b/>
           <w:sz w:val="18"/>
         </w:rPr>
-        <w:t>To make them, run the app and take terminal screenshot.</w:t>
+        <w:t>04-member-dashboard.png - Member Dashboard - browse, search, issue, return, my books</w:t>
       </w:r>
+    </w:p>
+    <w:p>
+      <w:pPr>
+        <w:jc w:val="center"/>
+      </w:pPr>
+      <w:r>
+        <w:drawing>
+          <wp:inline xmlns:a="http://schemas.openxmlformats.org/drawingml/2006/main" xmlns:pic="http://schemas.openxmlformats.org/drawingml/2006/picture">
+            <wp:extent cx="5029200" cy="2045208"/>
+            <wp:docPr id="6" name="Picture 6"/>
+            <wp:cNvGraphicFramePr>
+              <a:graphicFrameLocks noChangeAspect="1"/>
+            </wp:cNvGraphicFramePr>
+            <a:graphic>
+              <a:graphicData uri="http://schemas.openxmlformats.org/drawingml/2006/picture">
+                <pic:pic>
+                  <pic:nvPicPr>
+                    <pic:cNvPr id="0" name="04-member-dashboard.png"/>
+                    <pic:cNvPicPr/>
+                  </pic:nvPicPr>
+                  <pic:blipFill>
+                    <a:blip r:embed="rId14"/>
+                    <a:stretch>
+                      <a:fillRect/>
+                    </a:stretch>
+                  </pic:blipFill>
+                  <pic:spPr>
+                    <a:xfrm>
+                      <a:off x="0" y="0"/>
+                      <a:ext cx="5029200" cy="2045208"/>
+                    </a:xfrm>
+                    <a:prstGeom prst="rect"/>
+                  </pic:spPr>
+                </pic:pic>
+              </a:graphicData>
+            </a:graphic>
+          </wp:inline>
+        </w:drawing>
+      </w:r>
+    </w:p>
+    <w:p>
+      <w:pPr>
+        <w:spacing w:after="120"/>
+      </w:pPr>
+    </w:p>
+    <w:p>
+      <w:pPr>
+        <w:jc w:val="center"/>
+      </w:pPr>
+      <w:r>
+        <w:rPr>
+          <w:b/>
+          <w:sz w:val="18"/>
+        </w:rPr>
+        <w:t>05-reports.png - Reports - totals, copies, issues, overdue and most borrowed</w:t>
+      </w:r>
+    </w:p>
+    <w:p>
+      <w:pPr>
+        <w:jc w:val="center"/>
+      </w:pPr>
+      <w:r>
+        <w:drawing>
+          <wp:inline xmlns:a="http://schemas.openxmlformats.org/drawingml/2006/main" xmlns:pic="http://schemas.openxmlformats.org/drawingml/2006/picture">
+            <wp:extent cx="5029200" cy="1902714"/>
+            <wp:docPr id="7" name="Picture 7"/>
+            <wp:cNvGraphicFramePr>
+              <a:graphicFrameLocks noChangeAspect="1"/>
+            </wp:cNvGraphicFramePr>
+            <a:graphic>
+              <a:graphicData uri="http://schemas.openxmlformats.org/drawingml/2006/picture">
+                <pic:pic>
+                  <pic:nvPicPr>
+                    <pic:cNvPr id="0" name="05-reports.png"/>
+                    <pic:cNvPicPr/>
+                  </pic:nvPicPr>
+                  <pic:blipFill>
+                    <a:blip r:embed="rId15"/>
+                    <a:stretch>
+                      <a:fillRect/>
+                    </a:stretch>
+                  </pic:blipFill>
+                  <pic:spPr>
+                    <a:xfrm>
+                      <a:off x="0" y="0"/>
+                      <a:ext cx="5029200" cy="1902714"/>
+                    </a:xfrm>
+                    <a:prstGeom prst="rect"/>
+                  </pic:spPr>
+                </pic:pic>
+              </a:graphicData>
+            </a:graphic>
+          </wp:inline>
+        </w:drawing>
+      </w:r>
+    </w:p>
+    <w:p>
+      <w:pPr>
+        <w:spacing w:after="120"/>
+      </w:pPr>
+    </w:p>
+    <w:p>
+      <w:pPr>
+        <w:jc w:val="center"/>
+      </w:pPr>
+      <w:r>
+        <w:rPr>
+          <w:b/>
+          <w:sz w:val="18"/>
+        </w:rPr>
+        <w:t>06-issue-return.png - Issue and Return flow - issuing a book and my books view</w:t>
+      </w:r>
+    </w:p>
+    <w:p>
+      <w:pPr>
+        <w:jc w:val="center"/>
+      </w:pPr>
+      <w:r>
+        <w:drawing>
+          <wp:inline xmlns:a="http://schemas.openxmlformats.org/drawingml/2006/main" xmlns:pic="http://schemas.openxmlformats.org/drawingml/2006/picture">
+            <wp:extent cx="5029200" cy="3042666"/>
+            <wp:docPr id="8" name="Picture 8"/>
+            <wp:cNvGraphicFramePr>
+              <a:graphicFrameLocks noChangeAspect="1"/>
+            </wp:cNvGraphicFramePr>
+            <a:graphic>
+              <a:graphicData uri="http://schemas.openxmlformats.org/drawingml/2006/picture">
+                <pic:pic>
+                  <pic:nvPicPr>
+                    <pic:cNvPr id="0" name="06-issue-return.png"/>
+                    <pic:cNvPicPr/>
+                  </pic:nvPicPr>
+                  <pic:blipFill>
+                    <a:blip r:embed="rId16"/>
+                    <a:stretch>
+                      <a:fillRect/>
+                    </a:stretch>
+                  </pic:blipFill>
+                  <pic:spPr>
+                    <a:xfrm>
+                      <a:off x="0" y="0"/>
+                      <a:ext cx="5029200" cy="3042666"/>
+                    </a:xfrm>
+                    <a:prstGeom prst="rect"/>
+                  </pic:spPr>
+                </pic:pic>
+              </a:graphicData>
+            </a:graphic>
+          </wp:inline>
+        </w:drawing>
+      </w:r>
+    </w:p>
+    <w:p>
+      <w:pPr>
+        <w:spacing w:after="120"/>
+      </w:pPr>
     </w:p>
     <w:p>
       <w:pPr>

</xml_diff>

<commit_message>
fix report format and screenshots
</commit_message>
<xml_diff>
--- a/docs/REPORT.docx
+++ b/docs/REPORT.docx
@@ -4,13 +4,25 @@
   <w:body>
     <w:p>
       <w:pPr>
-        <w:spacing w:after="240"/>
+        <w:spacing w:after="40"/>
+        <w:jc w:val="center"/>
+      </w:pPr>
+    </w:p>
+    <w:p>
+      <w:pPr>
+        <w:spacing w:after="40"/>
+        <w:jc w:val="center"/>
+      </w:pPr>
+    </w:p>
+    <w:p>
+      <w:pPr>
+        <w:spacing w:after="360" w:before="240"/>
         <w:jc w:val="center"/>
       </w:pPr>
       <w:r>
         <w:drawing>
           <wp:inline xmlns:a="http://schemas.openxmlformats.org/drawingml/2006/main" xmlns:pic="http://schemas.openxmlformats.org/drawingml/2006/picture">
-            <wp:extent cx="3200400" cy="1373505"/>
+            <wp:extent cx="2926080" cy="1255776"/>
             <wp:docPr id="1" name="Picture 1"/>
             <wp:cNvGraphicFramePr>
               <a:graphicFrameLocks noChangeAspect="1"/>
@@ -31,7 +43,7 @@
                   <pic:spPr>
                     <a:xfrm>
                       <a:off x="0" y="0"/>
-                      <a:ext cx="3200400" cy="1373505"/>
+                      <a:ext cx="2926080" cy="1255776"/>
                     </a:xfrm>
                     <a:prstGeom prst="rect"/>
                   </pic:spPr>
@@ -44,46 +56,6 @@
     </w:p>
     <w:p>
       <w:pPr>
-        <w:spacing w:after="360"/>
-        <w:jc w:val="center"/>
-      </w:pPr>
-      <w:r>
-        <w:drawing>
-          <wp:inline xmlns:a="http://schemas.openxmlformats.org/drawingml/2006/main" xmlns:pic="http://schemas.openxmlformats.org/drawingml/2006/picture">
-            <wp:extent cx="5029200" cy="2514600"/>
-            <wp:docPr id="2" name="Picture 2"/>
-            <wp:cNvGraphicFramePr>
-              <a:graphicFrameLocks noChangeAspect="1"/>
-            </wp:cNvGraphicFramePr>
-            <a:graphic>
-              <a:graphicData uri="http://schemas.openxmlformats.org/drawingml/2006/picture">
-                <pic:pic>
-                  <pic:nvPicPr>
-                    <pic:cNvPr id="0" name="vit_campus.jpg"/>
-                    <pic:cNvPicPr/>
-                  </pic:nvPicPr>
-                  <pic:blipFill>
-                    <a:blip r:embed="rId10"/>
-                    <a:stretch>
-                      <a:fillRect/>
-                    </a:stretch>
-                  </pic:blipFill>
-                  <pic:spPr>
-                    <a:xfrm>
-                      <a:off x="0" y="0"/>
-                      <a:ext cx="5029200" cy="2514600"/>
-                    </a:xfrm>
-                    <a:prstGeom prst="rect"/>
-                  </pic:spPr>
-                </pic:pic>
-              </a:graphicData>
-            </a:graphic>
-          </wp:inline>
-        </w:drawing>
-      </w:r>
-    </w:p>
-    <w:p>
-      <w:pPr>
         <w:spacing w:after="80"/>
         <w:jc w:val="center"/>
       </w:pPr>
@@ -91,46 +63,47 @@
         <w:rPr>
           <w:b/>
           <w:color w:val="1A3C6E"/>
-          <w:sz w:val="32"/>
+          <w:sz w:val="30"/>
         </w:rPr>
         <w:t>VIT BHOPAL UNIVERSITY</w:t>
       </w:r>
     </w:p>
     <w:p>
       <w:pPr>
-        <w:spacing w:after="360"/>
+        <w:spacing w:after="480"/>
         <w:jc w:val="center"/>
       </w:pPr>
       <w:r>
         <w:rPr>
           <w:i/>
-          <w:color w:val="666666"/>
-          <w:sz w:val="16"/>
+          <w:color w:val="555555"/>
+          <w:sz w:val="17"/>
         </w:rPr>
         <w:t>Bhopal-Indore Highway, Kothri Kalan, Sehore, MP - 466114</w:t>
       </w:r>
     </w:p>
     <w:p>
       <w:pPr>
-        <w:spacing w:after="120"/>
+        <w:spacing w:after="160"/>
         <w:jc w:val="center"/>
       </w:pPr>
       <w:r>
         <w:rPr>
           <w:b/>
           <w:color w:val="0F2A44"/>
-          <w:sz w:val="44"/>
+          <w:sz w:val="48"/>
         </w:rPr>
         <w:t>Library Management System</w:t>
       </w:r>
     </w:p>
     <w:p>
       <w:pPr>
-        <w:spacing w:after="360"/>
+        <w:spacing w:after="480"/>
         <w:jc w:val="center"/>
       </w:pPr>
       <w:r>
         <w:rPr>
+          <w:i/>
           <w:color w:val="444444"/>
           <w:sz w:val="22"/>
         </w:rPr>
@@ -139,12 +112,13 @@
     </w:p>
     <w:p>
       <w:pPr>
-        <w:spacing w:after="40"/>
+        <w:spacing w:after="80"/>
         <w:jc w:val="center"/>
       </w:pPr>
       <w:r>
         <w:rPr>
           <w:b/>
+          <w:color w:val="1A3C6E"/>
           <w:sz w:val="24"/>
         </w:rPr>
         <w:t>Subject Code: CSE2006</w:t>
@@ -152,32 +126,41 @@
     </w:p>
     <w:p>
       <w:pPr>
-        <w:spacing w:after="360"/>
+        <w:spacing w:after="400"/>
         <w:jc w:val="center"/>
       </w:pPr>
       <w:r>
         <w:rPr>
           <w:b/>
+          <w:color w:val="1A3C6E"/>
           <w:sz w:val="24"/>
         </w:rPr>
         <w:t>Subject Name: Programming in Java</w:t>
       </w:r>
     </w:p>
+    <w:p>
+      <w:pPr>
+        <w:spacing w:after="40"/>
+        <w:jc w:val="center"/>
+      </w:pPr>
+    </w:p>
     <w:tbl>
       <w:tblPr>
         <w:tblStyle w:val="LightGrid-Accent1"/>
         <w:tblW w:type="auto" w:w="0"/>
+        <w:jc w:val="center"/>
         <w:tblLayout w:type="fixed"/>
         <w:tblLook w:firstColumn="1" w:firstRow="1" w:lastColumn="0" w:lastRow="0" w:noHBand="0" w:noVBand="1" w:val="04A0"/>
       </w:tblPr>
       <w:tblGrid>
-        <w:gridCol w:w="4320"/>
-        <w:gridCol w:w="4320"/>
+        <w:gridCol w:w="3600"/>
+        <w:gridCol w:w="3600"/>
       </w:tblGrid>
       <w:tr>
         <w:tc>
           <w:tcPr>
-            <w:tcW w:type="dxa" w:w="5270"/>
+            <w:tcW w:type="dxa" w:w="5100"/>
+            <w:shd w:fill="1A3C6E"/>
           </w:tcPr>
           <w:p>
             <w:pPr>
@@ -186,6 +169,7 @@
             <w:r>
               <w:rPr>
                 <w:b/>
+                <w:color w:val="FFFFFF"/>
                 <w:sz w:val="20"/>
               </w:rPr>
               <w:t>Submitted By</w:t>
@@ -194,7 +178,8 @@
         </w:tc>
         <w:tc>
           <w:tcPr>
-            <w:tcW w:type="dxa" w:w="5270"/>
+            <w:tcW w:type="dxa" w:w="5100"/>
+            <w:shd w:fill="1A3C6E"/>
           </w:tcPr>
           <w:p>
             <w:pPr>
@@ -203,6 +188,7 @@
             <w:r>
               <w:rPr>
                 <w:b/>
+                <w:color w:val="FFFFFF"/>
                 <w:sz w:val="20"/>
               </w:rPr>
               <w:t>Details</w:t>
@@ -213,11 +199,11 @@
       <w:tr>
         <w:tc>
           <w:tcPr>
-            <w:tcW w:type="dxa" w:w="4320"/>
+            <w:tcW w:type="dxa" w:w="3600"/>
           </w:tcPr>
           <w:p>
             <w:pPr>
-              <w:jc w:val="left"/>
+              <w:jc w:val="center"/>
             </w:pPr>
             <w:r>
               <w:rPr>
@@ -230,7 +216,7 @@
         </w:tc>
         <w:tc>
           <w:tcPr>
-            <w:tcW w:type="dxa" w:w="4320"/>
+            <w:tcW w:type="dxa" w:w="3600"/>
           </w:tcPr>
           <w:p>
             <w:pPr>
@@ -248,11 +234,11 @@
       <w:tr>
         <w:tc>
           <w:tcPr>
-            <w:tcW w:type="dxa" w:w="4320"/>
+            <w:tcW w:type="dxa" w:w="3600"/>
           </w:tcPr>
           <w:p>
             <w:pPr>
-              <w:jc w:val="left"/>
+              <w:jc w:val="center"/>
             </w:pPr>
             <w:r>
               <w:rPr>
@@ -265,7 +251,7 @@
         </w:tc>
         <w:tc>
           <w:tcPr>
-            <w:tcW w:type="dxa" w:w="4320"/>
+            <w:tcW w:type="dxa" w:w="3600"/>
           </w:tcPr>
           <w:p>
             <w:pPr>
@@ -283,11 +269,11 @@
       <w:tr>
         <w:tc>
           <w:tcPr>
-            <w:tcW w:type="dxa" w:w="4320"/>
+            <w:tcW w:type="dxa" w:w="3600"/>
           </w:tcPr>
           <w:p>
             <w:pPr>
-              <w:jc w:val="left"/>
+              <w:jc w:val="center"/>
             </w:pPr>
             <w:r>
               <w:rPr>
@@ -300,7 +286,7 @@
         </w:tc>
         <w:tc>
           <w:tcPr>
-            <w:tcW w:type="dxa" w:w="4320"/>
+            <w:tcW w:type="dxa" w:w="3600"/>
           </w:tcPr>
           <w:p>
             <w:pPr>
@@ -318,11 +304,46 @@
       <w:tr>
         <w:tc>
           <w:tcPr>
-            <w:tcW w:type="dxa" w:w="4320"/>
+            <w:tcW w:type="dxa" w:w="3600"/>
+          </w:tcPr>
+          <w:p>
+            <w:pPr>
+              <w:jc w:val="center"/>
+            </w:pPr>
+            <w:r>
+              <w:rPr>
+                <w:b/>
+                <w:sz w:val="20"/>
+              </w:rPr>
+              <w:t>School</w:t>
+            </w:r>
+          </w:p>
+        </w:tc>
+        <w:tc>
+          <w:tcPr>
+            <w:tcW w:type="dxa" w:w="3600"/>
           </w:tcPr>
           <w:p>
             <w:pPr>
               <w:jc w:val="left"/>
+            </w:pPr>
+            <w:r>
+              <w:rPr>
+                <w:sz w:val="20"/>
+              </w:rPr>
+              <w:t>School of Computer Science</w:t>
+            </w:r>
+          </w:p>
+        </w:tc>
+      </w:tr>
+      <w:tr>
+        <w:tc>
+          <w:tcPr>
+            <w:tcW w:type="dxa" w:w="3600"/>
+          </w:tcPr>
+          <w:p>
+            <w:pPr>
+              <w:jc w:val="center"/>
             </w:pPr>
             <w:r>
               <w:rPr>
@@ -335,7 +356,7 @@
         </w:tc>
         <w:tc>
           <w:tcPr>
-            <w:tcW w:type="dxa" w:w="4320"/>
+            <w:tcW w:type="dxa" w:w="3600"/>
           </w:tcPr>
           <w:p>
             <w:pPr>
@@ -353,11 +374,12 @@
     </w:tbl>
     <w:p>
       <w:pPr>
-        <w:spacing w:after="240"/>
+        <w:spacing w:after="320"/>
       </w:pPr>
     </w:p>
     <w:p>
       <w:pPr>
+        <w:spacing w:after="80"/>
         <w:jc w:val="center"/>
       </w:pPr>
       <w:r>
@@ -370,6 +392,19 @@
       </w:r>
     </w:p>
     <w:p>
+      <w:pPr>
+        <w:jc w:val="center"/>
+      </w:pPr>
+      <w:r>
+        <w:rPr>
+          <w:b/>
+          <w:color w:val="1A3C6E"/>
+          <w:sz w:val="18"/>
+        </w:rPr>
+        <w:t>VIT Bhopal University</w:t>
+      </w:r>
+    </w:p>
+    <w:p>
       <w:r>
         <w:br w:type="page"/>
       </w:r>
@@ -378,12 +413,15 @@
       <w:pPr>
         <w:spacing w:after="240"/>
         <w:jc w:val="center"/>
+        <w:pBdr>
+          <w:bottom w:val="single" w:sz="6" w:space="1" w:color="1A3C6E"/>
+        </w:pBdr>
       </w:pPr>
       <w:r>
         <w:rPr>
           <w:b/>
           <w:color w:val="1A3C6E"/>
-          <w:sz w:val="36"/>
+          <w:sz w:val="32"/>
         </w:rPr>
         <w:t>PROJECT REPORT</w:t>
       </w:r>
@@ -394,13 +432,16 @@
       </w:pPr>
       <w:r>
         <w:rPr>
+          <w:b/>
           <w:color w:val="1A3C6E"/>
+          <w:sz w:val="26"/>
         </w:rPr>
         <w:t>Abstract</w:t>
       </w:r>
     </w:p>
     <w:p>
       <w:pPr>
+        <w:spacing w:after="120"/>
         <w:jc w:val="left"/>
       </w:pPr>
       <w:r>
@@ -418,200 +459,237 @@
       </w:pPr>
       <w:r>
         <w:rPr>
+          <w:b/>
           <w:color w:val="1A3C6E"/>
+          <w:sz w:val="26"/>
         </w:rPr>
         <w:t>Table of Contents</w:t>
       </w:r>
     </w:p>
     <w:p>
       <w:pPr>
-        <w:pStyle w:val="ListBullet"/>
+        <w:spacing w:after="20" w:before="20"/>
       </w:pPr>
       <w:r>
         <w:rPr>
-          <w:sz w:val="20"/>
+          <w:rFonts w:ascii="Calibri" w:hAnsi="Calibri"/>
+          <w:color w:val="333333"/>
+          <w:sz w:val="19"/>
+        </w:rPr>
+        <w:t>1. Introduction ...................................................................................... 2</w:t>
+      </w:r>
+    </w:p>
+    <w:p>
+      <w:pPr>
+        <w:spacing w:after="20" w:before="20"/>
+      </w:pPr>
+      <w:r>
+        <w:rPr>
+          <w:rFonts w:ascii="Calibri" w:hAnsi="Calibri"/>
+          <w:color w:val="333333"/>
+          <w:sz w:val="19"/>
+        </w:rPr>
+        <w:t>2. Problem Statement ......................................................................... 2</w:t>
+      </w:r>
+    </w:p>
+    <w:p>
+      <w:pPr>
+        <w:spacing w:after="20" w:before="20"/>
+      </w:pPr>
+      <w:r>
+        <w:rPr>
+          <w:rFonts w:ascii="Calibri" w:hAnsi="Calibri"/>
+          <w:color w:val="333333"/>
+          <w:sz w:val="19"/>
+        </w:rPr>
+        <w:t>3. Objectives ........................................................................................ 2</w:t>
+      </w:r>
+    </w:p>
+    <w:p>
+      <w:pPr>
+        <w:spacing w:after="20" w:before="20"/>
+      </w:pPr>
+      <w:r>
+        <w:rPr>
+          <w:rFonts w:ascii="Calibri" w:hAnsi="Calibri"/>
+          <w:color w:val="333333"/>
+          <w:sz w:val="19"/>
+        </w:rPr>
+        <w:t>4. Scope ............................................................................................... 2</w:t>
+      </w:r>
+    </w:p>
+    <w:p>
+      <w:pPr>
+        <w:spacing w:after="20" w:before="20"/>
+      </w:pPr>
+      <w:r>
+        <w:rPr>
+          <w:rFonts w:ascii="Calibri" w:hAnsi="Calibri"/>
+          <w:color w:val="333333"/>
+          <w:sz w:val="19"/>
+        </w:rPr>
+        <w:t>5. Target Users .................................................................................... 3</w:t>
+      </w:r>
+    </w:p>
+    <w:p>
+      <w:pPr>
+        <w:spacing w:after="20" w:before="20"/>
+      </w:pPr>
+      <w:r>
+        <w:rPr>
+          <w:rFonts w:ascii="Calibri" w:hAnsi="Calibri"/>
+          <w:color w:val="333333"/>
+          <w:sz w:val="19"/>
+        </w:rPr>
+        <w:t>6. Functional Requirements ............................................................... 3</w:t>
+      </w:r>
+    </w:p>
+    <w:p>
+      <w:pPr>
+        <w:spacing w:after="20" w:before="20"/>
+      </w:pPr>
+      <w:r>
+        <w:rPr>
+          <w:rFonts w:ascii="Calibri" w:hAnsi="Calibri"/>
+          <w:color w:val="333333"/>
+          <w:sz w:val="19"/>
+        </w:rPr>
+        <w:t>7. Non-Functional Requirements ...................................................... 4</w:t>
+      </w:r>
+    </w:p>
+    <w:p>
+      <w:pPr>
+        <w:spacing w:after="20" w:before="20"/>
+      </w:pPr>
+      <w:r>
+        <w:rPr>
+          <w:rFonts w:ascii="Calibri" w:hAnsi="Calibri"/>
+          <w:color w:val="333333"/>
+          <w:sz w:val="19"/>
+        </w:rPr>
+        <w:t>8. System Architecture .................................................................... 4</w:t>
+      </w:r>
+    </w:p>
+    <w:p>
+      <w:pPr>
+        <w:spacing w:after="20" w:before="20"/>
+      </w:pPr>
+      <w:r>
+        <w:rPr>
+          <w:rFonts w:ascii="Calibri" w:hAnsi="Calibri"/>
+          <w:color w:val="333333"/>
+          <w:sz w:val="19"/>
+        </w:rPr>
+        <w:t>9. Process Flow ................................................................................... 5</w:t>
+      </w:r>
+    </w:p>
+    <w:p>
+      <w:pPr>
+        <w:spacing w:after="20" w:before="20"/>
+      </w:pPr>
+      <w:r>
+        <w:rPr>
+          <w:rFonts w:ascii="Calibri" w:hAnsi="Calibri"/>
+          <w:color w:val="333333"/>
+          <w:sz w:val="19"/>
+        </w:rPr>
+        <w:t>10. UML Diagrams .......................................................................... 5</w:t>
+      </w:r>
+    </w:p>
+    <w:p>
+      <w:pPr>
+        <w:spacing w:after="20" w:before="20"/>
+      </w:pPr>
+      <w:r>
+        <w:rPr>
+          <w:rFonts w:ascii="Calibri" w:hAnsi="Calibri"/>
+          <w:color w:val="333333"/>
+          <w:sz w:val="19"/>
+        </w:rPr>
+        <w:t>11. Database Design ...................................................................... 6</w:t>
+      </w:r>
+    </w:p>
+    <w:p>
+      <w:pPr>
+        <w:spacing w:after="20" w:before="20"/>
+      </w:pPr>
+      <w:r>
+        <w:rPr>
+          <w:rFonts w:ascii="Calibri" w:hAnsi="Calibri"/>
+          <w:color w:val="333333"/>
+          <w:sz w:val="19"/>
+        </w:rPr>
+        <w:t>12. Implementation ........................................................................ 6</w:t>
+      </w:r>
+    </w:p>
+    <w:p>
+      <w:pPr>
+        <w:spacing w:after="20" w:before="20"/>
+      </w:pPr>
+      <w:r>
+        <w:rPr>
+          <w:rFonts w:ascii="Calibri" w:hAnsi="Calibri"/>
+          <w:color w:val="333333"/>
+          <w:sz w:val="19"/>
+        </w:rPr>
+        <w:t>13. Testing .......................................................................................... 7</w:t>
+      </w:r>
+    </w:p>
+    <w:p>
+      <w:pPr>
+        <w:spacing w:after="20" w:before="20"/>
+      </w:pPr>
+      <w:r>
+        <w:rPr>
+          <w:rFonts w:ascii="Calibri" w:hAnsi="Calibri"/>
+          <w:color w:val="333333"/>
+          <w:sz w:val="19"/>
+        </w:rPr>
+        <w:t>14. Screenshots .............................................................................. 7</w:t>
+      </w:r>
+    </w:p>
+    <w:p>
+      <w:pPr>
+        <w:spacing w:after="20" w:before="20"/>
+      </w:pPr>
+      <w:r>
+        <w:rPr>
+          <w:rFonts w:ascii="Calibri" w:hAnsi="Calibri"/>
+          <w:color w:val="333333"/>
+          <w:sz w:val="19"/>
+        </w:rPr>
+        <w:t>15. Conclusion .................................................................................. 9</w:t>
+      </w:r>
+    </w:p>
+    <w:p>
+      <w:pPr>
+        <w:spacing w:after="20" w:before="20"/>
+      </w:pPr>
+      <w:r>
+        <w:rPr>
+          <w:rFonts w:ascii="Calibri" w:hAnsi="Calibri"/>
+          <w:color w:val="333333"/>
+          <w:sz w:val="19"/>
+        </w:rPr>
+        <w:t>16. References ................................................................................. 9</w:t>
+      </w:r>
+    </w:p>
+    <w:p>
+      <w:pPr>
+        <w:pStyle w:val="Heading1"/>
+      </w:pPr>
+      <w:r>
+        <w:rPr>
+          <w:b/>
+          <w:color w:val="1A3C6E"/>
+          <w:sz w:val="26"/>
         </w:rPr>
         <w:t>1. Introduction</w:t>
       </w:r>
     </w:p>
     <w:p>
       <w:pPr>
-        <w:pStyle w:val="ListBullet"/>
-      </w:pPr>
-      <w:r>
-        <w:rPr>
-          <w:sz w:val="20"/>
-        </w:rPr>
-        <w:t>2. Problem Statement</w:t>
-      </w:r>
-    </w:p>
-    <w:p>
-      <w:pPr>
-        <w:pStyle w:val="ListBullet"/>
-      </w:pPr>
-      <w:r>
-        <w:rPr>
-          <w:sz w:val="20"/>
-        </w:rPr>
-        <w:t>3. Objectives</w:t>
-      </w:r>
-    </w:p>
-    <w:p>
-      <w:pPr>
-        <w:pStyle w:val="ListBullet"/>
-      </w:pPr>
-      <w:r>
-        <w:rPr>
-          <w:sz w:val="20"/>
-        </w:rPr>
-        <w:t>4. Scope</w:t>
-      </w:r>
-    </w:p>
-    <w:p>
-      <w:pPr>
-        <w:pStyle w:val="ListBullet"/>
-      </w:pPr>
-      <w:r>
-        <w:rPr>
-          <w:sz w:val="20"/>
-        </w:rPr>
-        <w:t>5. Target Users</w:t>
-      </w:r>
-    </w:p>
-    <w:p>
-      <w:pPr>
-        <w:pStyle w:val="ListBullet"/>
-      </w:pPr>
-      <w:r>
-        <w:rPr>
-          <w:sz w:val="20"/>
-        </w:rPr>
-        <w:t>6. Functional Requirements</w:t>
-      </w:r>
-    </w:p>
-    <w:p>
-      <w:pPr>
-        <w:pStyle w:val="ListBullet"/>
-      </w:pPr>
-      <w:r>
-        <w:rPr>
-          <w:sz w:val="20"/>
-        </w:rPr>
-        <w:t>7. Non-Functional Requirements</w:t>
-      </w:r>
-    </w:p>
-    <w:p>
-      <w:pPr>
-        <w:pStyle w:val="ListBullet"/>
-      </w:pPr>
-      <w:r>
-        <w:rPr>
-          <w:sz w:val="20"/>
-        </w:rPr>
-        <w:t>8. System Architecture</w:t>
-      </w:r>
-    </w:p>
-    <w:p>
-      <w:pPr>
-        <w:pStyle w:val="ListBullet"/>
-      </w:pPr>
-      <w:r>
-        <w:rPr>
-          <w:sz w:val="20"/>
-        </w:rPr>
-        <w:t>9. Process Flow</w:t>
-      </w:r>
-    </w:p>
-    <w:p>
-      <w:pPr>
-        <w:pStyle w:val="ListBullet"/>
-      </w:pPr>
-      <w:r>
-        <w:rPr>
-          <w:sz w:val="20"/>
-        </w:rPr>
-        <w:t>10. UML Diagrams</w:t>
-      </w:r>
-    </w:p>
-    <w:p>
-      <w:pPr>
-        <w:pStyle w:val="ListBullet"/>
-      </w:pPr>
-      <w:r>
-        <w:rPr>
-          <w:sz w:val="20"/>
-        </w:rPr>
-        <w:t>11. Database Design</w:t>
-      </w:r>
-    </w:p>
-    <w:p>
-      <w:pPr>
-        <w:pStyle w:val="ListBullet"/>
-      </w:pPr>
-      <w:r>
-        <w:rPr>
-          <w:sz w:val="20"/>
-        </w:rPr>
-        <w:t>12. Implementation</w:t>
-      </w:r>
-    </w:p>
-    <w:p>
-      <w:pPr>
-        <w:pStyle w:val="ListBullet"/>
-      </w:pPr>
-      <w:r>
-        <w:rPr>
-          <w:sz w:val="20"/>
-        </w:rPr>
-        <w:t>13. Testing</w:t>
-      </w:r>
-    </w:p>
-    <w:p>
-      <w:pPr>
-        <w:pStyle w:val="ListBullet"/>
-      </w:pPr>
-      <w:r>
-        <w:rPr>
-          <w:sz w:val="20"/>
-        </w:rPr>
-        <w:t>14. Screenshots</w:t>
-      </w:r>
-    </w:p>
-    <w:p>
-      <w:pPr>
-        <w:pStyle w:val="ListBullet"/>
-      </w:pPr>
-      <w:r>
-        <w:rPr>
-          <w:sz w:val="20"/>
-        </w:rPr>
-        <w:t>15. Conclusion</w:t>
-      </w:r>
-    </w:p>
-    <w:p>
-      <w:pPr>
-        <w:pStyle w:val="ListBullet"/>
-      </w:pPr>
-      <w:r>
-        <w:rPr>
-          <w:sz w:val="20"/>
-        </w:rPr>
-        <w:t>16. References</w:t>
-      </w:r>
-    </w:p>
-    <w:p>
-      <w:pPr>
-        <w:pStyle w:val="Heading1"/>
-      </w:pPr>
-      <w:r>
-        <w:rPr>
-          <w:color w:val="1A3C6E"/>
-        </w:rPr>
-        <w:t>1. Introduction</w:t>
-      </w:r>
-    </w:p>
-    <w:p>
-      <w:pPr>
+        <w:spacing w:after="120"/>
         <w:jc w:val="left"/>
       </w:pPr>
       <w:r>
@@ -629,13 +707,16 @@
       </w:pPr>
       <w:r>
         <w:rPr>
+          <w:b/>
           <w:color w:val="1A3C6E"/>
+          <w:sz w:val="26"/>
         </w:rPr>
         <w:t>2. Problem Statement</w:t>
       </w:r>
     </w:p>
     <w:p>
       <w:pPr>
+        <w:spacing w:after="120"/>
         <w:jc w:val="left"/>
       </w:pPr>
       <w:r>
@@ -653,7 +734,9 @@
       </w:pPr>
       <w:r>
         <w:rPr>
+          <w:b/>
           <w:color w:val="1A3C6E"/>
+          <w:sz w:val="26"/>
         </w:rPr>
         <w:t>3. Objectives</w:t>
       </w:r>
@@ -661,6 +744,8 @@
     <w:p>
       <w:pPr>
         <w:pStyle w:val="ListBullet"/>
+        <w:spacing w:after="40"/>
+        <w:ind w:left="360"/>
       </w:pPr>
       <w:r>
         <w:rPr>
@@ -672,6 +757,8 @@
     <w:p>
       <w:pPr>
         <w:pStyle w:val="ListBullet"/>
+        <w:spacing w:after="40"/>
+        <w:ind w:left="360"/>
       </w:pPr>
       <w:r>
         <w:rPr>
@@ -683,6 +770,8 @@
     <w:p>
       <w:pPr>
         <w:pStyle w:val="ListBullet"/>
+        <w:spacing w:after="40"/>
+        <w:ind w:left="360"/>
       </w:pPr>
       <w:r>
         <w:rPr>
@@ -694,6 +783,8 @@
     <w:p>
       <w:pPr>
         <w:pStyle w:val="ListBullet"/>
+        <w:spacing w:after="40"/>
+        <w:ind w:left="360"/>
       </w:pPr>
       <w:r>
         <w:rPr>
@@ -708,7 +799,9 @@
       </w:pPr>
       <w:r>
         <w:rPr>
+          <w:b/>
           <w:color w:val="1A3C6E"/>
+          <w:sz w:val="26"/>
         </w:rPr>
         <w:t>4. Scope</w:t>
       </w:r>
@@ -719,7 +812,9 @@
       </w:pPr>
       <w:r>
         <w:rPr>
+          <w:b/>
           <w:color w:val="1A3C6E"/>
+          <w:sz w:val="22"/>
         </w:rPr>
         <w:t>In Scope</w:t>
       </w:r>
@@ -727,6 +822,8 @@
     <w:p>
       <w:pPr>
         <w:pStyle w:val="ListBullet"/>
+        <w:spacing w:after="40"/>
+        <w:ind w:left="360"/>
       </w:pPr>
       <w:r>
         <w:rPr>
@@ -738,6 +835,8 @@
     <w:p>
       <w:pPr>
         <w:pStyle w:val="ListBullet"/>
+        <w:spacing w:after="40"/>
+        <w:ind w:left="360"/>
       </w:pPr>
       <w:r>
         <w:rPr>
@@ -749,6 +848,8 @@
     <w:p>
       <w:pPr>
         <w:pStyle w:val="ListBullet"/>
+        <w:spacing w:after="40"/>
+        <w:ind w:left="360"/>
       </w:pPr>
       <w:r>
         <w:rPr>
@@ -760,6 +861,8 @@
     <w:p>
       <w:pPr>
         <w:pStyle w:val="ListBullet"/>
+        <w:spacing w:after="40"/>
+        <w:ind w:left="360"/>
       </w:pPr>
       <w:r>
         <w:rPr>
@@ -771,6 +874,8 @@
     <w:p>
       <w:pPr>
         <w:pStyle w:val="ListBullet"/>
+        <w:spacing w:after="40"/>
+        <w:ind w:left="360"/>
       </w:pPr>
       <w:r>
         <w:rPr>
@@ -782,6 +887,8 @@
     <w:p>
       <w:pPr>
         <w:pStyle w:val="ListBullet"/>
+        <w:spacing w:after="40"/>
+        <w:ind w:left="360"/>
       </w:pPr>
       <w:r>
         <w:rPr>
@@ -793,6 +900,8 @@
     <w:p>
       <w:pPr>
         <w:pStyle w:val="ListBullet"/>
+        <w:spacing w:after="40"/>
+        <w:ind w:left="360"/>
       </w:pPr>
       <w:r>
         <w:rPr>
@@ -807,7 +916,9 @@
       </w:pPr>
       <w:r>
         <w:rPr>
+          <w:b/>
           <w:color w:val="1A3C6E"/>
+          <w:sz w:val="22"/>
         </w:rPr>
         <w:t>Out of Scope</w:t>
       </w:r>
@@ -815,6 +926,8 @@
     <w:p>
       <w:pPr>
         <w:pStyle w:val="ListBullet"/>
+        <w:spacing w:after="40"/>
+        <w:ind w:left="360"/>
       </w:pPr>
       <w:r>
         <w:rPr>
@@ -826,6 +939,8 @@
     <w:p>
       <w:pPr>
         <w:pStyle w:val="ListBullet"/>
+        <w:spacing w:after="40"/>
+        <w:ind w:left="360"/>
       </w:pPr>
       <w:r>
         <w:rPr>
@@ -837,6 +952,8 @@
     <w:p>
       <w:pPr>
         <w:pStyle w:val="ListBullet"/>
+        <w:spacing w:after="40"/>
+        <w:ind w:left="360"/>
       </w:pPr>
       <w:r>
         <w:rPr>
@@ -848,6 +965,8 @@
     <w:p>
       <w:pPr>
         <w:pStyle w:val="ListBullet"/>
+        <w:spacing w:after="40"/>
+        <w:ind w:left="360"/>
       </w:pPr>
       <w:r>
         <w:rPr>
@@ -862,7 +981,9 @@
       </w:pPr>
       <w:r>
         <w:rPr>
+          <w:b/>
           <w:color w:val="1A3C6E"/>
+          <w:sz w:val="26"/>
         </w:rPr>
         <w:t>5. Target Users</w:t>
       </w:r>
@@ -873,7 +994,9 @@
       </w:pPr>
       <w:r>
         <w:rPr>
+          <w:b/>
           <w:color w:val="1A3C6E"/>
+          <w:sz w:val="22"/>
         </w:rPr>
         <w:t>Admin (Librarian)</w:t>
       </w:r>
@@ -881,7 +1004,16 @@
     <w:p>
       <w:pPr>
         <w:pStyle w:val="ListBullet"/>
-      </w:pPr>
+        <w:spacing w:after="40"/>
+        <w:ind w:left="360"/>
+      </w:pPr>
+      <w:r>
+        <w:rPr>
+          <w:b/>
+          <w:sz w:val="21"/>
+        </w:rPr>
+        <w:t xml:space="preserve">Goal: </w:t>
+      </w:r>
       <w:r>
         <w:rPr>
           <w:sz w:val="21"/>
@@ -892,12 +1024,21 @@
     <w:p>
       <w:pPr>
         <w:pStyle w:val="ListBullet"/>
-      </w:pPr>
+        <w:spacing w:after="40"/>
+        <w:ind w:left="360"/>
+      </w:pPr>
+      <w:r>
+        <w:rPr>
+          <w:b/>
+          <w:sz w:val="21"/>
+        </w:rPr>
+        <w:t xml:space="preserve">Pain: </w:t>
+      </w:r>
       <w:r>
         <w:rPr>
           <w:sz w:val="21"/>
         </w:rPr>
-        <w:t>Problem is manual entry takes time</w:t>
+        <w:t>Lot of manual entries, no quick search</w:t>
       </w:r>
     </w:p>
     <w:p>
@@ -906,7 +1047,9 @@
       </w:pPr>
       <w:r>
         <w:rPr>
+          <w:b/>
           <w:color w:val="1A3C6E"/>
+          <w:sz w:val="22"/>
         </w:rPr>
         <w:t>Member (Student)</w:t>
       </w:r>
@@ -914,23 +1057,41 @@
     <w:p>
       <w:pPr>
         <w:pStyle w:val="ListBullet"/>
-      </w:pPr>
+        <w:spacing w:after="40"/>
+        <w:ind w:left="360"/>
+      </w:pPr>
+      <w:r>
+        <w:rPr>
+          <w:b/>
+          <w:sz w:val="21"/>
+        </w:rPr>
+        <w:t xml:space="preserve">Goal: </w:t>
+      </w:r>
       <w:r>
         <w:rPr>
           <w:sz w:val="21"/>
         </w:rPr>
-        <w:t>Needs to find books, take and return easily</w:t>
+        <w:t>Find books, take and return easily</w:t>
       </w:r>
     </w:p>
     <w:p>
       <w:pPr>
         <w:pStyle w:val="ListBullet"/>
-      </w:pPr>
+        <w:spacing w:after="40"/>
+        <w:ind w:left="360"/>
+      </w:pPr>
+      <w:r>
+        <w:rPr>
+          <w:b/>
+          <w:sz w:val="21"/>
+        </w:rPr>
+        <w:t xml:space="preserve">Pain: </w:t>
+      </w:r>
       <w:r>
         <w:rPr>
           <w:sz w:val="21"/>
         </w:rPr>
-        <w:t>Problem is not knowing if book is there and forgetting due date</w:t>
+        <w:t>Not knowing if book is there and forgetting due date</w:t>
       </w:r>
     </w:p>
     <w:p>
@@ -939,7 +1100,9 @@
       </w:pPr>
       <w:r>
         <w:rPr>
+          <w:b/>
           <w:color w:val="1A3C6E"/>
+          <w:sz w:val="26"/>
         </w:rPr>
         <w:t>6. Functional Requirements</w:t>
       </w:r>
@@ -947,6 +1110,8 @@
     <w:p>
       <w:pPr>
         <w:pStyle w:val="ListBullet"/>
+        <w:spacing w:after="40"/>
+        <w:ind w:left="360"/>
       </w:pPr>
       <w:r>
         <w:rPr>
@@ -958,6 +1123,8 @@
     <w:p>
       <w:pPr>
         <w:pStyle w:val="ListBullet"/>
+        <w:spacing w:after="40"/>
+        <w:ind w:left="360"/>
       </w:pPr>
       <w:r>
         <w:rPr>
@@ -969,6 +1136,8 @@
     <w:p>
       <w:pPr>
         <w:pStyle w:val="ListBullet"/>
+        <w:spacing w:after="40"/>
+        <w:ind w:left="360"/>
       </w:pPr>
       <w:r>
         <w:rPr>
@@ -980,6 +1149,8 @@
     <w:p>
       <w:pPr>
         <w:pStyle w:val="ListBullet"/>
+        <w:spacing w:after="40"/>
+        <w:ind w:left="360"/>
       </w:pPr>
       <w:r>
         <w:rPr>
@@ -991,6 +1162,8 @@
     <w:p>
       <w:pPr>
         <w:pStyle w:val="ListBullet"/>
+        <w:spacing w:after="40"/>
+        <w:ind w:left="360"/>
       </w:pPr>
       <w:r>
         <w:rPr>
@@ -1002,6 +1175,8 @@
     <w:p>
       <w:pPr>
         <w:pStyle w:val="ListBullet"/>
+        <w:spacing w:after="40"/>
+        <w:ind w:left="360"/>
       </w:pPr>
       <w:r>
         <w:rPr>
@@ -1013,6 +1188,8 @@
     <w:p>
       <w:pPr>
         <w:pStyle w:val="ListBullet"/>
+        <w:spacing w:after="40"/>
+        <w:ind w:left="360"/>
       </w:pPr>
       <w:r>
         <w:rPr>
@@ -1024,6 +1201,8 @@
     <w:p>
       <w:pPr>
         <w:pStyle w:val="ListBullet"/>
+        <w:spacing w:after="40"/>
+        <w:ind w:left="360"/>
       </w:pPr>
       <w:r>
         <w:rPr>
@@ -1035,6 +1214,8 @@
     <w:p>
       <w:pPr>
         <w:pStyle w:val="ListBullet"/>
+        <w:spacing w:after="40"/>
+        <w:ind w:left="360"/>
       </w:pPr>
       <w:r>
         <w:rPr>
@@ -1046,6 +1227,8 @@
     <w:p>
       <w:pPr>
         <w:pStyle w:val="ListBullet"/>
+        <w:spacing w:after="40"/>
+        <w:ind w:left="360"/>
       </w:pPr>
       <w:r>
         <w:rPr>
@@ -1056,6 +1239,7 @@
     </w:p>
     <w:p>
       <w:pPr>
+        <w:spacing w:after="120"/>
         <w:jc w:val="left"/>
       </w:pPr>
       <w:r>
@@ -1071,22 +1255,29 @@
       <w:tblPr>
         <w:tblStyle w:val="LightGrid-Accent1"/>
         <w:tblW w:type="auto" w:w="0"/>
+        <w:jc w:val="center"/>
+        <w:tblLayout w:type="fixed"/>
         <w:tblLook w:firstColumn="1" w:firstRow="1" w:lastColumn="0" w:lastRow="0" w:noHBand="0" w:noVBand="1" w:val="04A0"/>
       </w:tblPr>
       <w:tblGrid>
-        <w:gridCol w:w="3513"/>
-        <w:gridCol w:w="3513"/>
-        <w:gridCol w:w="3513"/>
+        <w:gridCol w:w="3168"/>
+        <w:gridCol w:w="2880"/>
+        <w:gridCol w:w="2880"/>
       </w:tblGrid>
       <w:tr>
         <w:tc>
           <w:tcPr>
-            <w:tcW w:type="dxa" w:w="3513"/>
+            <w:tcW w:type="dxa" w:w="3400"/>
+            <w:shd w:fill="1A3C6E"/>
           </w:tcPr>
           <w:p>
+            <w:pPr>
+              <w:jc w:val="center"/>
+            </w:pPr>
             <w:r>
               <w:rPr>
                 <w:b/>
+                <w:color w:val="FFFFFF"/>
                 <w:sz w:val="18"/>
               </w:rPr>
               <w:t>Input</w:t>
@@ -1095,12 +1286,17 @@
         </w:tc>
         <w:tc>
           <w:tcPr>
-            <w:tcW w:type="dxa" w:w="3513"/>
+            <w:tcW w:type="dxa" w:w="3400"/>
+            <w:shd w:fill="1A3C6E"/>
           </w:tcPr>
           <w:p>
+            <w:pPr>
+              <w:jc w:val="center"/>
+            </w:pPr>
             <w:r>
               <w:rPr>
                 <w:b/>
+                <w:color w:val="FFFFFF"/>
                 <w:sz w:val="18"/>
               </w:rPr>
               <w:t>Check</w:t>
@@ -1109,12 +1305,17 @@
         </w:tc>
         <w:tc>
           <w:tcPr>
-            <w:tcW w:type="dxa" w:w="3513"/>
+            <w:tcW w:type="dxa" w:w="3400"/>
+            <w:shd w:fill="1A3C6E"/>
           </w:tcPr>
           <w:p>
+            <w:pPr>
+              <w:jc w:val="center"/>
+            </w:pPr>
             <w:r>
               <w:rPr>
                 <w:b/>
+                <w:color w:val="FFFFFF"/>
                 <w:sz w:val="18"/>
               </w:rPr>
               <w:t>Output</w:t>
@@ -1125,12 +1326,15 @@
       <w:tr>
         <w:tc>
           <w:tcPr>
-            <w:tcW w:type="dxa" w:w="3513"/>
+            <w:tcW w:type="dxa" w:w="3168"/>
           </w:tcPr>
           <w:p>
+            <w:pPr>
+              <w:jc w:val="left"/>
+            </w:pPr>
             <w:r>
               <w:rPr>
-                <w:sz w:val="16"/>
+                <w:sz w:val="17"/>
               </w:rPr>
               <w:t>username, password</w:t>
             </w:r>
@@ -1138,12 +1342,15 @@
         </w:tc>
         <w:tc>
           <w:tcPr>
-            <w:tcW w:type="dxa" w:w="3513"/>
+            <w:tcW w:type="dxa" w:w="2880"/>
           </w:tcPr>
           <w:p>
+            <w:pPr>
+              <w:jc w:val="left"/>
+            </w:pPr>
             <w:r>
               <w:rPr>
-                <w:sz w:val="16"/>
+                <w:sz w:val="17"/>
               </w:rPr>
               <w:t>check csv</w:t>
             </w:r>
@@ -1151,12 +1358,15 @@
         </w:tc>
         <w:tc>
           <w:tcPr>
-            <w:tcW w:type="dxa" w:w="3513"/>
+            <w:tcW w:type="dxa" w:w="2880"/>
           </w:tcPr>
           <w:p>
+            <w:pPr>
+              <w:jc w:val="left"/>
+            </w:pPr>
             <w:r>
               <w:rPr>
-                <w:sz w:val="16"/>
+                <w:sz w:val="17"/>
               </w:rPr>
               <w:t>login ok or error</w:t>
             </w:r>
@@ -1166,12 +1376,15 @@
       <w:tr>
         <w:tc>
           <w:tcPr>
-            <w:tcW w:type="dxa" w:w="3513"/>
+            <w:tcW w:type="dxa" w:w="3168"/>
           </w:tcPr>
           <w:p>
+            <w:pPr>
+              <w:jc w:val="left"/>
+            </w:pPr>
             <w:r>
               <w:rPr>
-                <w:sz w:val="16"/>
+                <w:sz w:val="17"/>
               </w:rPr>
               <w:t>book id, title, author, copies</w:t>
             </w:r>
@@ -1179,12 +1392,15 @@
         </w:tc>
         <w:tc>
           <w:tcPr>
-            <w:tcW w:type="dxa" w:w="3513"/>
+            <w:tcW w:type="dxa" w:w="2880"/>
           </w:tcPr>
           <w:p>
+            <w:pPr>
+              <w:jc w:val="left"/>
+            </w:pPr>
             <w:r>
               <w:rPr>
-                <w:sz w:val="16"/>
+                <w:sz w:val="17"/>
               </w:rPr>
               <w:t>save to books.csv</w:t>
             </w:r>
@@ -1192,12 +1408,15 @@
         </w:tc>
         <w:tc>
           <w:tcPr>
-            <w:tcW w:type="dxa" w:w="3513"/>
+            <w:tcW w:type="dxa" w:w="2880"/>
           </w:tcPr>
           <w:p>
+            <w:pPr>
+              <w:jc w:val="left"/>
+            </w:pPr>
             <w:r>
               <w:rPr>
-                <w:sz w:val="16"/>
+                <w:sz w:val="17"/>
               </w:rPr>
               <w:t>book added</w:t>
             </w:r>
@@ -1207,12 +1426,15 @@
       <w:tr>
         <w:tc>
           <w:tcPr>
-            <w:tcW w:type="dxa" w:w="3513"/>
+            <w:tcW w:type="dxa" w:w="3168"/>
           </w:tcPr>
           <w:p>
+            <w:pPr>
+              <w:jc w:val="left"/>
+            </w:pPr>
             <w:r>
               <w:rPr>
-                <w:sz w:val="16"/>
+                <w:sz w:val="17"/>
               </w:rPr>
               <w:t>username and book id for issue</w:t>
             </w:r>
@@ -1220,12 +1442,15 @@
         </w:tc>
         <w:tc>
           <w:tcPr>
-            <w:tcW w:type="dxa" w:w="3513"/>
+            <w:tcW w:type="dxa" w:w="2880"/>
           </w:tcPr>
           <w:p>
+            <w:pPr>
+              <w:jc w:val="left"/>
+            </w:pPr>
             <w:r>
               <w:rPr>
-                <w:sz w:val="16"/>
+                <w:sz w:val="17"/>
               </w:rPr>
               <w:t>check copy and limit</w:t>
             </w:r>
@@ -1233,12 +1458,15 @@
         </w:tc>
         <w:tc>
           <w:tcPr>
-            <w:tcW w:type="dxa" w:w="3513"/>
+            <w:tcW w:type="dxa" w:w="2880"/>
           </w:tcPr>
           <w:p>
+            <w:pPr>
+              <w:jc w:val="left"/>
+            </w:pPr>
             <w:r>
               <w:rPr>
-                <w:sz w:val="16"/>
+                <w:sz w:val="17"/>
               </w:rPr>
               <w:t>issued or error</w:t>
             </w:r>
@@ -1248,12 +1476,15 @@
       <w:tr>
         <w:tc>
           <w:tcPr>
-            <w:tcW w:type="dxa" w:w="3513"/>
+            <w:tcW w:type="dxa" w:w="3168"/>
           </w:tcPr>
           <w:p>
+            <w:pPr>
+              <w:jc w:val="left"/>
+            </w:pPr>
             <w:r>
               <w:rPr>
-                <w:sz w:val="16"/>
+                <w:sz w:val="17"/>
               </w:rPr>
               <w:t>username and book id for return</w:t>
             </w:r>
@@ -1261,12 +1492,15 @@
         </w:tc>
         <w:tc>
           <w:tcPr>
-            <w:tcW w:type="dxa" w:w="3513"/>
+            <w:tcW w:type="dxa" w:w="2880"/>
           </w:tcPr>
           <w:p>
+            <w:pPr>
+              <w:jc w:val="left"/>
+            </w:pPr>
             <w:r>
               <w:rPr>
-                <w:sz w:val="16"/>
+                <w:sz w:val="17"/>
               </w:rPr>
               <w:t>check active issue</w:t>
             </w:r>
@@ -1274,12 +1508,15 @@
         </w:tc>
         <w:tc>
           <w:tcPr>
-            <w:tcW w:type="dxa" w:w="3513"/>
+            <w:tcW w:type="dxa" w:w="2880"/>
           </w:tcPr>
           <w:p>
+            <w:pPr>
+              <w:jc w:val="left"/>
+            </w:pPr>
             <w:r>
               <w:rPr>
-                <w:sz w:val="16"/>
+                <w:sz w:val="17"/>
               </w:rPr>
               <w:t>returned or fine</w:t>
             </w:r>
@@ -1298,7 +1535,9 @@
       </w:pPr>
       <w:r>
         <w:rPr>
+          <w:b/>
           <w:color w:val="1A3C6E"/>
+          <w:sz w:val="26"/>
         </w:rPr>
         <w:t>7. Non-Functional Requirements</w:t>
       </w:r>
@@ -1306,6 +1545,7 @@
     <w:p>
       <w:pPr>
         <w:pStyle w:val="ListBullet"/>
+        <w:spacing w:after="40"/>
       </w:pPr>
       <w:r>
         <w:rPr>
@@ -1324,6 +1564,7 @@
     <w:p>
       <w:pPr>
         <w:pStyle w:val="ListBullet"/>
+        <w:spacing w:after="40"/>
       </w:pPr>
       <w:r>
         <w:rPr>
@@ -1342,6 +1583,7 @@
     <w:p>
       <w:pPr>
         <w:pStyle w:val="ListBullet"/>
+        <w:spacing w:after="40"/>
       </w:pPr>
       <w:r>
         <w:rPr>
@@ -1360,6 +1602,7 @@
     <w:p>
       <w:pPr>
         <w:pStyle w:val="ListBullet"/>
+        <w:spacing w:after="40"/>
       </w:pPr>
       <w:r>
         <w:rPr>
@@ -1378,6 +1621,7 @@
     <w:p>
       <w:pPr>
         <w:pStyle w:val="ListBullet"/>
+        <w:spacing w:after="40"/>
       </w:pPr>
       <w:r>
         <w:rPr>
@@ -1396,6 +1640,7 @@
     <w:p>
       <w:pPr>
         <w:pStyle w:val="ListBullet"/>
+        <w:spacing w:after="40"/>
       </w:pPr>
       <w:r>
         <w:rPr>
@@ -1417,13 +1662,16 @@
       </w:pPr>
       <w:r>
         <w:rPr>
+          <w:b/>
           <w:color w:val="1A3C6E"/>
+          <w:sz w:val="26"/>
         </w:rPr>
         <w:t>8. System Architecture</w:t>
       </w:r>
     </w:p>
     <w:p>
       <w:pPr>
+        <w:spacing w:after="120"/>
         <w:jc w:val="left"/>
       </w:pPr>
       <w:r>
@@ -1432,26 +1680,28 @@
           <w:i w:val="0"/>
           <w:sz w:val="21"/>
         </w:rPr>
-        <w:t>Modules: model, repo, service, util, Main. Each does one work.</w:t>
+        <w:t>Modules: model, repo, service, util, Main. Each does one work. CSV files are used for storage, no database needed.</w:t>
       </w:r>
     </w:p>
     <w:p>
       <w:r>
         <w:rPr>
           <w:b/>
+          <w:sz w:val="21"/>
         </w:rPr>
         <w:t>Folder structure:</w:t>
       </w:r>
     </w:p>
     <w:p>
       <w:pPr>
-        <w:jc w:val="left"/>
+        <w:spacing w:after="80" w:before="40"/>
+        <w:shd w:fill="F2F2F2"/>
       </w:pPr>
       <w:r>
         <w:rPr>
-          <w:b w:val="0"/>
-          <w:i w:val="0"/>
-          <w:sz w:val="18"/>
+          <w:rFonts w:ascii="Consolas" w:hAnsi="Consolas"/>
+          <w:color w:val="333333"/>
+          <w:sz w:val="17"/>
         </w:rPr>
         <w:t>src/main/java/com/cse2006/library/</w:t>
         <w:br/>
@@ -1468,6 +1718,7 @@
     </w:p>
     <w:p>
       <w:pPr>
+        <w:spacing w:after="120"/>
         <w:jc w:val="left"/>
       </w:pPr>
       <w:r>
@@ -1477,22 +1728,69 @@
           <w:color w:val="666666"/>
           <w:sz w:val="18"/>
         </w:rPr>
-        <w:t>Architecture Diagram (see docs/DESIGN.md for mermaid): Main CLI -&gt; Services -&gt; Repo -&gt; CSV files in data/</w:t>
+        <w:t>Architecture: Main CLI -&gt; Services -&gt; Repo -&gt; CSV files in data/</w:t>
       </w:r>
     </w:p>
     <w:p>
       <w:pPr>
-        <w:pStyle w:val="Heading1"/>
+        <w:spacing w:after="120"/>
+        <w:jc w:val="left"/>
       </w:pPr>
       <w:r>
         <w:rPr>
+          <w:b/>
+          <w:i w:val="0"/>
+          <w:sz w:val="18"/>
+        </w:rPr>
+        <w:t>Mermaid diagram (for docs/DESIGN.md):</w:t>
+      </w:r>
+    </w:p>
+    <w:p>
+      <w:pPr>
+        <w:spacing w:after="80" w:before="40"/>
+        <w:shd w:fill="F2F2F2"/>
+      </w:pPr>
+      <w:r>
+        <w:rPr>
+          <w:rFonts w:ascii="Consolas" w:hAnsi="Consolas"/>
+          <w:color w:val="333333"/>
+          <w:sz w:val="17"/>
+        </w:rPr>
+        <w:t>graph TD</w:t>
+        <w:br/>
+        <w:t xml:space="preserve">  A[Main CLI] --&gt; B[AuthService]</w:t>
+        <w:br/>
+        <w:t xml:space="preserve">  A --&gt; C[BookService]</w:t>
+        <w:br/>
+        <w:t xml:space="preserve">  A --&gt; D[IssueService]</w:t>
+        <w:br/>
+        <w:t xml:space="preserve">  A --&gt; E[ReportService]</w:t>
+        <w:br/>
+        <w:t xml:space="preserve">  B --&gt; F[UserStore]</w:t>
+        <w:br/>
+        <w:t xml:space="preserve">  C --&gt; G[BookStore]</w:t>
+        <w:br/>
+        <w:t xml:space="preserve">  D --&gt; G</w:t>
+        <w:br/>
+        <w:t xml:space="preserve">  D --&gt; H[IssueStore]</w:t>
+      </w:r>
+    </w:p>
+    <w:p>
+      <w:pPr>
+        <w:pStyle w:val="Heading1"/>
+      </w:pPr>
+      <w:r>
+        <w:rPr>
+          <w:b/>
           <w:color w:val="1A3C6E"/>
+          <w:sz w:val="26"/>
         </w:rPr>
         <w:t>9. Process Flow</w:t>
       </w:r>
     </w:p>
     <w:p>
       <w:pPr>
+        <w:spacing w:after="120"/>
         <w:jc w:val="left"/>
       </w:pPr>
       <w:r>
@@ -1506,15 +1804,26 @@
     </w:p>
     <w:p>
       <w:pPr>
-        <w:jc w:val="left"/>
+        <w:spacing w:after="80" w:before="40"/>
+        <w:shd w:fill="F2F2F2"/>
       </w:pPr>
       <w:r>
         <w:rPr>
-          <w:b w:val="0"/>
-          <w:i/>
-          <w:sz w:val="18"/>
+          <w:rFonts w:ascii="Consolas" w:hAnsi="Consolas"/>
+          <w:color w:val="333333"/>
+          <w:sz w:val="17"/>
         </w:rPr>
-        <w:t>Flow: Login -&gt; Check -&gt; Role? -&gt; Admin (Manage Books/Members/Reports) or Member (Browse/Issue/Return)</w:t>
+        <w:t>flowchart TD</w:t>
+        <w:br/>
+        <w:t xml:space="preserve">  Start --&gt; Login</w:t>
+        <w:br/>
+        <w:t xml:space="preserve">  Login --&gt; Check{Login ok?}</w:t>
+        <w:br/>
+        <w:t xml:space="preserve">  Check -- Yes --&gt; Role{Role?}</w:t>
+        <w:br/>
+        <w:t xml:space="preserve">  Role -- Admin --&gt; Manage Books/Members/Reports</w:t>
+        <w:br/>
+        <w:t xml:space="preserve">  Role -- Member --&gt; Browse/Issue/Return</w:t>
       </w:r>
     </w:p>
     <w:p>
@@ -1523,7 +1832,9 @@
       </w:pPr>
       <w:r>
         <w:rPr>
+          <w:b/>
           <w:color w:val="1A3C6E"/>
+          <w:sz w:val="26"/>
         </w:rPr>
         <w:t>10. UML Diagrams</w:t>
       </w:r>
@@ -1534,13 +1845,16 @@
       </w:pPr>
       <w:r>
         <w:rPr>
+          <w:b/>
           <w:color w:val="1A3C6E"/>
+          <w:sz w:val="22"/>
         </w:rPr>
         <w:t>Use Case</w:t>
       </w:r>
     </w:p>
     <w:p>
       <w:pPr>
+        <w:spacing w:after="120"/>
         <w:jc w:val="left"/>
       </w:pPr>
       <w:r>
@@ -1560,22 +1874,31 @@
       </w:pPr>
       <w:r>
         <w:rPr>
+          <w:b/>
           <w:color w:val="1A3C6E"/>
+          <w:sz w:val="22"/>
         </w:rPr>
         <w:t>Class Diagram</w:t>
       </w:r>
     </w:p>
     <w:p>
       <w:pPr>
-        <w:jc w:val="left"/>
+        <w:spacing w:after="80" w:before="40"/>
+        <w:shd w:fill="F2F2F2"/>
       </w:pPr>
       <w:r>
         <w:rPr>
-          <w:b w:val="0"/>
-          <w:i w:val="0"/>
-          <w:sz w:val="18"/>
+          <w:rFonts w:ascii="Consolas" w:hAnsi="Consolas"/>
+          <w:color w:val="333333"/>
+          <w:sz w:val="17"/>
         </w:rPr>
-        <w:t>User, Book, Issue, UserStore, BookStore, IssueStore, AuthService, BookService, IssueService, ReportService. See docs/DESIGN.md for full mermaid diagram.</w:t>
+        <w:t>classDiagram</w:t>
+        <w:br/>
+        <w:t xml:space="preserve">  class User { String id; String username; String password; Role role; }</w:t>
+        <w:br/>
+        <w:t xml:space="preserve">  class Book { String id; String title; int total; int available; }</w:t>
+        <w:br/>
+        <w:t xml:space="preserve">  class Issue { String id; String bookId; String username; LocalDate due; }</w:t>
       </w:r>
     </w:p>
     <w:p>
@@ -1584,24 +1907,35 @@
       </w:pPr>
       <w:r>
         <w:rPr>
+          <w:b/>
           <w:color w:val="1A3C6E"/>
+          <w:sz w:val="22"/>
         </w:rPr>
         <w:t>Sequence</w:t>
       </w:r>
     </w:p>
     <w:p>
       <w:pPr>
-        <w:jc w:val="left"/>
+        <w:spacing w:after="80" w:before="40"/>
+        <w:shd w:fill="F2F2F2"/>
       </w:pPr>
       <w:r>
         <w:rPr>
-          <w:b w:val="0"/>
-          <w:i w:val="0"/>
-          <w:sz w:val="18"/>
+          <w:rFonts w:ascii="Consolas" w:hAnsi="Consolas"/>
+          <w:color w:val="333333"/>
+          <w:sz w:val="17"/>
         </w:rPr>
-        <w:t>Main -&gt; AuthService -&gt; UserStore for login</w:t>
+        <w:t>sequenceDiagram</w:t>
         <w:br/>
-        <w:t>Main -&gt; IssueService -&gt; BookStore/IssueStore for issue</w:t>
+        <w:t xml:space="preserve">  Main-&gt;&gt;AuthService: login(username, password)</w:t>
+        <w:br/>
+        <w:t xml:space="preserve">  AuthService-&gt;&gt;UserStore: findByUsername()</w:t>
+        <w:br/>
+        <w:t xml:space="preserve">  Main-&gt;&gt;IssueService: issueBook(user, bookId)</w:t>
+        <w:br/>
+        <w:t xml:space="preserve">  IssueService-&gt;&gt;BookStore: findById()</w:t>
+        <w:br/>
+        <w:t xml:space="preserve">  IssueService-&gt;&gt;IssueStore: add()</w:t>
       </w:r>
     </w:p>
     <w:p>
@@ -1610,13 +1944,16 @@
       </w:pPr>
       <w:r>
         <w:rPr>
+          <w:b/>
           <w:color w:val="1A3C6E"/>
+          <w:sz w:val="26"/>
         </w:rPr>
         <w:t>11. Database Design</w:t>
       </w:r>
     </w:p>
     <w:p>
       <w:pPr>
+        <w:spacing w:after="120"/>
         <w:jc w:val="left"/>
       </w:pPr>
       <w:r>
@@ -1625,7 +1962,7 @@
           <w:i w:val="0"/>
           <w:sz w:val="21"/>
         </w:rPr>
-        <w:t>Files in data folder, not pushed to github.</w:t>
+        <w:t>Files in data folder, not pushed to github. Each user has own csv, books and issues are single files.</w:t>
       </w:r>
     </w:p>
     <w:p>
@@ -1634,24 +1971,29 @@
       </w:pPr>
       <w:r>
         <w:rPr>
+          <w:b/>
           <w:color w:val="1A3C6E"/>
+          <w:sz w:val="22"/>
         </w:rPr>
         <w:t>ER Diagram</w:t>
       </w:r>
     </w:p>
     <w:p>
       <w:pPr>
-        <w:jc w:val="left"/>
+        <w:spacing w:after="80" w:before="40"/>
+        <w:shd w:fill="F2F2F2"/>
       </w:pPr>
       <w:r>
         <w:rPr>
-          <w:b w:val="0"/>
-          <w:i w:val="0"/>
-          <w:sz w:val="18"/>
+          <w:rFonts w:ascii="Consolas" w:hAnsi="Consolas"/>
+          <w:color w:val="333333"/>
+          <w:sz w:val="17"/>
         </w:rPr>
-        <w:t>USER ||--o{ ISSUE : has</w:t>
+        <w:t>erDiagram</w:t>
         <w:br/>
-        <w:t>BOOK ||--o{ ISSUE : issued_as</w:t>
+        <w:t xml:space="preserve">  USER ||--o{ ISSUE : has</w:t>
+        <w:br/>
+        <w:t xml:space="preserve">  BOOK ||--o{ ISSUE : issued_as</w:t>
       </w:r>
     </w:p>
     <w:p>
@@ -1660,13 +2002,16 @@
       </w:pPr>
       <w:r>
         <w:rPr>
+          <w:b/>
           <w:color w:val="1A3C6E"/>
+          <w:sz w:val="22"/>
         </w:rPr>
         <w:t>Schema</w:t>
       </w:r>
     </w:p>
     <w:p>
       <w:pPr>
+        <w:spacing w:after="120"/>
         <w:jc w:val="left"/>
       </w:pPr>
       <w:r>
@@ -1680,6 +2025,7 @@
     </w:p>
     <w:p>
       <w:pPr>
+        <w:spacing w:after="120"/>
         <w:jc w:val="left"/>
       </w:pPr>
       <w:r>
@@ -1693,6 +2039,7 @@
     </w:p>
     <w:p>
       <w:pPr>
+        <w:spacing w:after="120"/>
         <w:jc w:val="left"/>
       </w:pPr>
       <w:r>
@@ -1706,6 +2053,7 @@
     </w:p>
     <w:p>
       <w:pPr>
+        <w:spacing w:after="120"/>
         <w:jc w:val="left"/>
       </w:pPr>
       <w:r>
@@ -1723,13 +2071,16 @@
       </w:pPr>
       <w:r>
         <w:rPr>
+          <w:b/>
           <w:color w:val="1A3C6E"/>
+          <w:sz w:val="26"/>
         </w:rPr>
         <w:t>12. Implementation</w:t>
       </w:r>
     </w:p>
     <w:p>
       <w:pPr>
+        <w:spacing w:after="120"/>
         <w:jc w:val="left"/>
       </w:pPr>
       <w:r>
@@ -1738,17 +2089,12 @@
           <w:i w:val="0"/>
           <w:sz w:val="21"/>
         </w:rPr>
-        <w:t>Language: Java 17</w:t>
-        <w:br/>
-        <w:t>Build: Maven</w:t>
-        <w:br/>
-        <w:t>Storage: CSV files</w:t>
-        <w:br/>
-        <w:t>CLI: Scanner and simple menu, colors with ANSI</w:t>
+        <w:t>Language: Java 17, Build: Maven, Storage: CSV files, CLI: Scanner and simple menu</w:t>
       </w:r>
     </w:p>
     <w:p>
       <w:pPr>
+        <w:spacing w:after="120"/>
         <w:jc w:val="left"/>
       </w:pPr>
       <w:r>
@@ -1757,7 +2103,7 @@
           <w:i w:val="0"/>
           <w:sz w:val="21"/>
         </w:rPr>
-        <w:t>Key code is simple if-else and file read/write, no framework.</w:t>
+        <w:t>Key code is simple if-else and file read/write, no framework. All logic is in service classes with plain checks.</w:t>
       </w:r>
     </w:p>
     <w:p>
@@ -1770,13 +2116,14 @@
     </w:p>
     <w:p>
       <w:pPr>
-        <w:jc w:val="left"/>
+        <w:spacing w:after="80" w:before="40"/>
+        <w:shd w:fill="F2F2F2"/>
       </w:pPr>
       <w:r>
         <w:rPr>
-          <w:b w:val="0"/>
-          <w:i w:val="0"/>
-          <w:sz w:val="18"/>
+          <w:rFonts w:ascii="Consolas" w:hAnsi="Consolas"/>
+          <w:color w:val="333333"/>
+          <w:sz w:val="17"/>
         </w:rPr>
         <w:t>git clone https://github.com/SykikXO/CSE2006.git</w:t>
         <w:br/>
@@ -1799,13 +2146,14 @@
     </w:p>
     <w:p>
       <w:pPr>
-        <w:jc w:val="left"/>
+        <w:spacing w:after="80" w:before="40"/>
+        <w:shd w:fill="F2F2F2"/>
       </w:pPr>
       <w:r>
         <w:rPr>
-          <w:b w:val="0"/>
-          <w:i w:val="0"/>
-          <w:sz w:val="18"/>
+          <w:rFonts w:ascii="Consolas" w:hAnsi="Consolas"/>
+          <w:color w:val="333333"/>
+          <w:sz w:val="17"/>
         </w:rPr>
         <w:t>mvn test</w:t>
       </w:r>
@@ -1816,13 +2164,16 @@
       </w:pPr>
       <w:r>
         <w:rPr>
+          <w:b/>
           <w:color w:val="1A3C6E"/>
+          <w:sz w:val="26"/>
         </w:rPr>
         <w:t>13. Testing</w:t>
       </w:r>
     </w:p>
     <w:p>
       <w:pPr>
+        <w:spacing w:after="120"/>
         <w:jc w:val="left"/>
       </w:pPr>
       <w:r>
@@ -1837,6 +2188,8 @@
     <w:p>
       <w:pPr>
         <w:pStyle w:val="ListBullet"/>
+        <w:spacing w:after="40"/>
+        <w:ind w:left="360"/>
       </w:pPr>
       <w:r>
         <w:rPr>
@@ -1848,6 +2201,8 @@
     <w:p>
       <w:pPr>
         <w:pStyle w:val="ListBullet"/>
+        <w:spacing w:after="40"/>
+        <w:ind w:left="360"/>
       </w:pPr>
       <w:r>
         <w:rPr>
@@ -1859,6 +2214,8 @@
     <w:p>
       <w:pPr>
         <w:pStyle w:val="ListBullet"/>
+        <w:spacing w:after="40"/>
+        <w:ind w:left="360"/>
       </w:pPr>
       <w:r>
         <w:rPr>
@@ -1870,6 +2227,8 @@
     <w:p>
       <w:pPr>
         <w:pStyle w:val="ListBullet"/>
+        <w:spacing w:after="40"/>
+        <w:ind w:left="360"/>
       </w:pPr>
       <w:r>
         <w:rPr>
@@ -1881,6 +2240,8 @@
     <w:p>
       <w:pPr>
         <w:pStyle w:val="ListBullet"/>
+        <w:spacing w:after="40"/>
+        <w:ind w:left="360"/>
       </w:pPr>
       <w:r>
         <w:rPr>
@@ -1892,6 +2253,8 @@
     <w:p>
       <w:pPr>
         <w:pStyle w:val="ListBullet"/>
+        <w:spacing w:after="40"/>
+        <w:ind w:left="360"/>
       </w:pPr>
       <w:r>
         <w:rPr>
@@ -1902,6 +2265,7 @@
     </w:p>
     <w:p>
       <w:pPr>
+        <w:spacing w:after="120"/>
         <w:jc w:val="left"/>
       </w:pPr>
       <w:r>
@@ -1910,7 +2274,7 @@
           <w:i w:val="0"/>
           <w:sz w:val="21"/>
         </w:rPr>
-        <w:t>Result: 7 tests, all pass.</w:t>
+        <w:t>Result: 7 tests, all pass. Run mvn test to verify.</w:t>
       </w:r>
     </w:p>
     <w:p>
@@ -1919,32 +2283,51 @@
       </w:pPr>
       <w:r>
         <w:rPr>
+          <w:b/>
           <w:color w:val="1A3C6E"/>
+          <w:sz w:val="26"/>
         </w:rPr>
         <w:t>14. Screenshots</w:t>
       </w:r>
     </w:p>
     <w:p>
       <w:pPr>
+        <w:spacing w:after="120"/>
+        <w:jc w:val="left"/>
+      </w:pPr>
+      <w:r>
+        <w:rPr>
+          <w:b w:val="0"/>
+          <w:i/>
+          <w:sz w:val="18"/>
+        </w:rPr>
+        <w:t>All screenshots are taken from actual program run. They show the CLI menus and flows.</w:t>
+      </w:r>
+    </w:p>
+    <w:p>
+      <w:pPr>
+        <w:spacing w:after="40"/>
         <w:jc w:val="center"/>
       </w:pPr>
       <w:r>
         <w:rPr>
           <w:b/>
+          <w:color w:val="1A3C6E"/>
           <w:sz w:val="18"/>
         </w:rPr>
-        <w:t>01-login.png - Login and Auth Menu - shows demo logins and member registration note</w:t>
+        <w:t>Login and Auth Menu - shows demo logins and member registration note</w:t>
       </w:r>
     </w:p>
     <w:p>
       <w:pPr>
+        <w:spacing w:after="160"/>
         <w:jc w:val="center"/>
       </w:pPr>
       <w:r>
         <w:drawing>
           <wp:inline xmlns:a="http://schemas.openxmlformats.org/drawingml/2006/main" xmlns:pic="http://schemas.openxmlformats.org/drawingml/2006/picture">
-            <wp:extent cx="5029200" cy="3612642"/>
-            <wp:docPr id="3" name="Picture 3"/>
+            <wp:extent cx="5303520" cy="4000369"/>
+            <wp:docPr id="2" name="Picture 2"/>
             <wp:cNvGraphicFramePr>
               <a:graphicFrameLocks noChangeAspect="1"/>
             </wp:cNvGraphicFramePr>
@@ -1956,7 +2339,7 @@
                     <pic:cNvPicPr/>
                   </pic:nvPicPr>
                   <pic:blipFill>
-                    <a:blip r:embed="rId11"/>
+                    <a:blip r:embed="rId10"/>
                     <a:stretch>
                       <a:fillRect/>
                     </a:stretch>
@@ -1964,7 +2347,7 @@
                   <pic:spPr>
                     <a:xfrm>
                       <a:off x="0" y="0"/>
-                      <a:ext cx="5029200" cy="3612642"/>
+                      <a:ext cx="5303520" cy="4000369"/>
                     </a:xfrm>
                     <a:prstGeom prst="rect"/>
                   </pic:spPr>
@@ -1977,30 +2360,28 @@
     </w:p>
     <w:p>
       <w:pPr>
-        <w:spacing w:after="120"/>
-      </w:pPr>
-    </w:p>
-    <w:p>
-      <w:pPr>
+        <w:spacing w:after="40"/>
         <w:jc w:val="center"/>
       </w:pPr>
       <w:r>
         <w:rPr>
           <w:b/>
+          <w:color w:val="1A3C6E"/>
           <w:sz w:val="18"/>
         </w:rPr>
-        <w:t>02-admin-dashboard.png - Admin Dashboard - manage books, members, reports</w:t>
+        <w:t>Admin Dashboard - manage books, members, reports</w:t>
       </w:r>
     </w:p>
     <w:p>
       <w:pPr>
+        <w:spacing w:after="160"/>
         <w:jc w:val="center"/>
       </w:pPr>
       <w:r>
         <w:drawing>
           <wp:inline xmlns:a="http://schemas.openxmlformats.org/drawingml/2006/main" xmlns:pic="http://schemas.openxmlformats.org/drawingml/2006/picture">
-            <wp:extent cx="5029200" cy="1902714"/>
-            <wp:docPr id="4" name="Picture 4"/>
+            <wp:extent cx="5303520" cy="2182020"/>
+            <wp:docPr id="3" name="Picture 3"/>
             <wp:cNvGraphicFramePr>
               <a:graphicFrameLocks noChangeAspect="1"/>
             </wp:cNvGraphicFramePr>
@@ -2012,7 +2393,7 @@
                     <pic:cNvPicPr/>
                   </pic:nvPicPr>
                   <pic:blipFill>
-                    <a:blip r:embed="rId12"/>
+                    <a:blip r:embed="rId11"/>
                     <a:stretch>
                       <a:fillRect/>
                     </a:stretch>
@@ -2020,7 +2401,7 @@
                   <pic:spPr>
                     <a:xfrm>
                       <a:off x="0" y="0"/>
-                      <a:ext cx="5029200" cy="1902714"/>
+                      <a:ext cx="5303520" cy="2182020"/>
                     </a:xfrm>
                     <a:prstGeom prst="rect"/>
                   </pic:spPr>
@@ -2033,30 +2414,28 @@
     </w:p>
     <w:p>
       <w:pPr>
-        <w:spacing w:after="120"/>
-      </w:pPr>
-    </w:p>
-    <w:p>
-      <w:pPr>
+        <w:spacing w:after="40"/>
         <w:jc w:val="center"/>
       </w:pPr>
       <w:r>
         <w:rPr>
           <w:b/>
+          <w:color w:val="1A3C6E"/>
           <w:sz w:val="18"/>
         </w:rPr>
-        <w:t>03-manage-books.png - Manage Books - list with Avail/Total, add/search/edit/delete</w:t>
+        <w:t>Manage Books - list with Avail/Total, add/search/edit/delete</w:t>
       </w:r>
     </w:p>
     <w:p>
       <w:pPr>
+        <w:spacing w:after="160"/>
         <w:jc w:val="center"/>
       </w:pPr>
       <w:r>
         <w:drawing>
           <wp:inline xmlns:a="http://schemas.openxmlformats.org/drawingml/2006/main" xmlns:pic="http://schemas.openxmlformats.org/drawingml/2006/picture">
-            <wp:extent cx="5029200" cy="2900172"/>
-            <wp:docPr id="5" name="Picture 5"/>
+            <wp:extent cx="5303520" cy="3545782"/>
+            <wp:docPr id="4" name="Picture 4"/>
             <wp:cNvGraphicFramePr>
               <a:graphicFrameLocks noChangeAspect="1"/>
             </wp:cNvGraphicFramePr>
@@ -2068,7 +2447,7 @@
                     <pic:cNvPicPr/>
                   </pic:nvPicPr>
                   <pic:blipFill>
-                    <a:blip r:embed="rId13"/>
+                    <a:blip r:embed="rId12"/>
                     <a:stretch>
                       <a:fillRect/>
                     </a:stretch>
@@ -2076,7 +2455,7 @@
                   <pic:spPr>
                     <a:xfrm>
                       <a:off x="0" y="0"/>
-                      <a:ext cx="5029200" cy="2900172"/>
+                      <a:ext cx="5303520" cy="3545782"/>
                     </a:xfrm>
                     <a:prstGeom prst="rect"/>
                   </pic:spPr>
@@ -2089,30 +2468,28 @@
     </w:p>
     <w:p>
       <w:pPr>
-        <w:spacing w:after="120"/>
-      </w:pPr>
-    </w:p>
-    <w:p>
-      <w:pPr>
+        <w:spacing w:after="40"/>
         <w:jc w:val="center"/>
       </w:pPr>
       <w:r>
         <w:rPr>
           <w:b/>
+          <w:color w:val="1A3C6E"/>
           <w:sz w:val="18"/>
         </w:rPr>
-        <w:t>04-member-dashboard.png - Member Dashboard - browse, search, issue, return, my books</w:t>
+        <w:t>Member Dashboard - browse, search, issue, return, my books</w:t>
       </w:r>
     </w:p>
     <w:p>
       <w:pPr>
+        <w:spacing w:after="160"/>
         <w:jc w:val="center"/>
       </w:pPr>
       <w:r>
         <w:drawing>
           <wp:inline xmlns:a="http://schemas.openxmlformats.org/drawingml/2006/main" xmlns:pic="http://schemas.openxmlformats.org/drawingml/2006/picture">
-            <wp:extent cx="5029200" cy="2045208"/>
-            <wp:docPr id="6" name="Picture 6"/>
+            <wp:extent cx="5303520" cy="3091195"/>
+            <wp:docPr id="5" name="Picture 5"/>
             <wp:cNvGraphicFramePr>
               <a:graphicFrameLocks noChangeAspect="1"/>
             </wp:cNvGraphicFramePr>
@@ -2124,7 +2501,7 @@
                     <pic:cNvPicPr/>
                   </pic:nvPicPr>
                   <pic:blipFill>
-                    <a:blip r:embed="rId14"/>
+                    <a:blip r:embed="rId13"/>
                     <a:stretch>
                       <a:fillRect/>
                     </a:stretch>
@@ -2132,7 +2509,7 @@
                   <pic:spPr>
                     <a:xfrm>
                       <a:off x="0" y="0"/>
-                      <a:ext cx="5029200" cy="2045208"/>
+                      <a:ext cx="5303520" cy="3091195"/>
                     </a:xfrm>
                     <a:prstGeom prst="rect"/>
                   </pic:spPr>
@@ -2145,30 +2522,28 @@
     </w:p>
     <w:p>
       <w:pPr>
-        <w:spacing w:after="120"/>
-      </w:pPr>
-    </w:p>
-    <w:p>
-      <w:pPr>
+        <w:spacing w:after="40"/>
         <w:jc w:val="center"/>
       </w:pPr>
       <w:r>
         <w:rPr>
           <w:b/>
+          <w:color w:val="1A3C6E"/>
           <w:sz w:val="18"/>
         </w:rPr>
-        <w:t>05-reports.png - Reports - totals, copies, issues, overdue and most borrowed</w:t>
+        <w:t>Reports - totals, copies, issues, overdue and most borrowed</w:t>
       </w:r>
     </w:p>
     <w:p>
       <w:pPr>
+        <w:spacing w:after="160"/>
         <w:jc w:val="center"/>
       </w:pPr>
       <w:r>
         <w:drawing>
           <wp:inline xmlns:a="http://schemas.openxmlformats.org/drawingml/2006/main" xmlns:pic="http://schemas.openxmlformats.org/drawingml/2006/picture">
-            <wp:extent cx="5029200" cy="1902714"/>
-            <wp:docPr id="7" name="Picture 7"/>
+            <wp:extent cx="5303520" cy="2485078"/>
+            <wp:docPr id="6" name="Picture 6"/>
             <wp:cNvGraphicFramePr>
               <a:graphicFrameLocks noChangeAspect="1"/>
             </wp:cNvGraphicFramePr>
@@ -2180,7 +2555,7 @@
                     <pic:cNvPicPr/>
                   </pic:nvPicPr>
                   <pic:blipFill>
-                    <a:blip r:embed="rId15"/>
+                    <a:blip r:embed="rId14"/>
                     <a:stretch>
                       <a:fillRect/>
                     </a:stretch>
@@ -2188,7 +2563,7 @@
                   <pic:spPr>
                     <a:xfrm>
                       <a:off x="0" y="0"/>
-                      <a:ext cx="5029200" cy="1902714"/>
+                      <a:ext cx="5303520" cy="2485078"/>
                     </a:xfrm>
                     <a:prstGeom prst="rect"/>
                   </pic:spPr>
@@ -2201,30 +2576,28 @@
     </w:p>
     <w:p>
       <w:pPr>
-        <w:spacing w:after="120"/>
-      </w:pPr>
-    </w:p>
-    <w:p>
-      <w:pPr>
+        <w:spacing w:after="40"/>
         <w:jc w:val="center"/>
       </w:pPr>
       <w:r>
         <w:rPr>
           <w:b/>
+          <w:color w:val="1A3C6E"/>
           <w:sz w:val="18"/>
         </w:rPr>
-        <w:t>06-issue-return.png - Issue and Return flow - issuing a book and my books view</w:t>
+        <w:t>Issue and Return flow - issuing a book and viewing my books</w:t>
       </w:r>
     </w:p>
     <w:p>
       <w:pPr>
+        <w:spacing w:after="160"/>
         <w:jc w:val="center"/>
       </w:pPr>
       <w:r>
         <w:drawing>
           <wp:inline xmlns:a="http://schemas.openxmlformats.org/drawingml/2006/main" xmlns:pic="http://schemas.openxmlformats.org/drawingml/2006/picture">
-            <wp:extent cx="5029200" cy="3042666"/>
-            <wp:docPr id="8" name="Picture 8"/>
+            <wp:extent cx="5303520" cy="1424374"/>
+            <wp:docPr id="7" name="Picture 7"/>
             <wp:cNvGraphicFramePr>
               <a:graphicFrameLocks noChangeAspect="1"/>
             </wp:cNvGraphicFramePr>
@@ -2236,7 +2609,7 @@
                     <pic:cNvPicPr/>
                   </pic:nvPicPr>
                   <pic:blipFill>
-                    <a:blip r:embed="rId16"/>
+                    <a:blip r:embed="rId15"/>
                     <a:stretch>
                       <a:fillRect/>
                     </a:stretch>
@@ -2244,7 +2617,7 @@
                   <pic:spPr>
                     <a:xfrm>
                       <a:off x="0" y="0"/>
-                      <a:ext cx="5029200" cy="3042666"/>
+                      <a:ext cx="5303520" cy="1424374"/>
                     </a:xfrm>
                     <a:prstGeom prst="rect"/>
                   </pic:spPr>
@@ -2257,22 +2630,20 @@
     </w:p>
     <w:p>
       <w:pPr>
-        <w:spacing w:after="120"/>
-      </w:pPr>
-    </w:p>
-    <w:p>
-      <w:pPr>
         <w:pStyle w:val="Heading1"/>
       </w:pPr>
       <w:r>
         <w:rPr>
+          <w:b/>
           <w:color w:val="1A3C6E"/>
+          <w:sz w:val="26"/>
         </w:rPr>
         <w:t>15. Conclusion</w:t>
       </w:r>
     </w:p>
     <w:p>
       <w:pPr>
+        <w:spacing w:after="120"/>
         <w:jc w:val="left"/>
       </w:pPr>
       <w:r>
@@ -2281,7 +2652,7 @@
           <w:i w:val="0"/>
           <w:sz w:val="21"/>
         </w:rPr>
-        <w:t>The app covers all asked parts: user management, catalog and circulation, reporting, with simple CSV storage and clear menu flow. It is easy to run and check. Future work can add PDF export or fine payment.</w:t>
+        <w:t>The app covers all asked parts: user management, catalog and circulation, reporting, with simple CSV storage and clear menu flow. It is easy to run and check. Future work can add PDF export or fine payment. The code is kept simple for college level, easy to understand and explain.</w:t>
       </w:r>
     </w:p>
     <w:p>
@@ -2290,7 +2661,9 @@
       </w:pPr>
       <w:r>
         <w:rPr>
+          <w:b/>
           <w:color w:val="1A3C6E"/>
+          <w:sz w:val="26"/>
         </w:rPr>
         <w:t>16. References</w:t>
       </w:r>
@@ -2298,44 +2671,69 @@
     <w:p>
       <w:pPr>
         <w:pStyle w:val="ListBullet"/>
+        <w:spacing w:after="40"/>
+        <w:ind w:left="360"/>
       </w:pPr>
       <w:r>
         <w:rPr>
           <w:sz w:val="21"/>
         </w:rPr>
-        <w:t>Java docs</w:t>
+        <w:t>Java docs - docs.oracle.com/javase/17</w:t>
       </w:r>
     </w:p>
     <w:p>
       <w:pPr>
         <w:pStyle w:val="ListBullet"/>
+        <w:spacing w:after="40"/>
+        <w:ind w:left="360"/>
       </w:pPr>
       <w:r>
         <w:rPr>
           <w:sz w:val="21"/>
         </w:rPr>
-        <w:t>Maven docs</w:t>
+        <w:t>Maven docs - maven.apache.org</w:t>
       </w:r>
     </w:p>
     <w:p>
       <w:pPr>
         <w:pStyle w:val="ListBullet"/>
+        <w:spacing w:after="40"/>
+        <w:ind w:left="360"/>
       </w:pPr>
       <w:r>
         <w:rPr>
           <w:sz w:val="21"/>
         </w:rPr>
-        <w:t>College lab notes for library system</w:t>
+        <w:t>College lab notes for library system - CSE2006</w:t>
       </w:r>
     </w:p>
     <w:sectPr>
+      <w:footerReference w:type="default" r:id="rId16"/>
       <w:pgSz w:w="12240" w:h="15840"/>
-      <w:pgMar w:top="850" w:right="850" w:bottom="850" w:left="850" w:header="720" w:footer="720" w:gutter="0"/>
+      <w:pgMar w:top="680" w:right="1020" w:bottom="680" w:left="1020" w:header="720" w:footer="720" w:gutter="0"/>
       <w:cols w:space="720"/>
       <w:docGrid w:linePitch="360"/>
     </w:sectPr>
   </w:body>
 </w:document>
+</file>
+
+<file path=word/footer1.xml><?xml version="1.0" encoding="utf-8"?>
+<w:ftr xmlns:m="http://schemas.openxmlformats.org/officeDocument/2006/math" xmlns:mc="http://schemas.openxmlformats.org/markup-compatibility/2006" xmlns:mo="http://schemas.microsoft.com/office/mac/office/2008/main" xmlns:mv="urn:schemas-microsoft-com:mac:vml" xmlns:o="urn:schemas-microsoft-com:office:office" xmlns:r="http://schemas.openxmlformats.org/officeDocument/2006/relationships" xmlns:v="urn:schemas-microsoft-com:vml" xmlns:w10="urn:schemas-microsoft-com:office:word" xmlns:w14="http://schemas.microsoft.com/office/word/2010/wordml" xmlns:w="http://schemas.openxmlformats.org/wordprocessingml/2006/main" xmlns:wne="http://schemas.microsoft.com/office/word/2006/wordml" xmlns:wp14="http://schemas.microsoft.com/office/word/2010/wordprocessingDrawing" xmlns:wp="http://schemas.openxmlformats.org/drawingml/2006/wordprocessingDrawing" xmlns:wpc="http://schemas.microsoft.com/office/word/2010/wordprocessingCanvas" xmlns:wpg="http://schemas.microsoft.com/office/word/2010/wordprocessingGroup" xmlns:wpi="http://schemas.microsoft.com/office/word/2010/wordprocessingInk" xmlns:wps="http://schemas.microsoft.com/office/word/2010/wordprocessingShape" mc:Ignorable="w14 wp14">
+  <w:p>
+    <w:pPr>
+      <w:pStyle w:val="Footer"/>
+      <w:jc w:val="center"/>
+    </w:pPr>
+    <w:r>
+      <w:rPr>
+        <w:color w:val="888888"/>
+        <w:sz w:val="16"/>
+      </w:rPr>
+      <w:t>CSE2006 - Programming in Java | Mayank Kushwaha - 24BCY10147 | VIT Bhopal</w:t>
+    </w:r>
+  </w:p>
+</w:ftr>
 </file>
 
 <file path=word/numbering.xml><?xml version="1.0" encoding="utf-8"?>
@@ -2764,14 +3162,14 @@
     <w:pPr>
       <w:keepNext/>
       <w:keepLines/>
-      <w:spacing w:before="480" w:after="0"/>
+      <w:spacing w:before="240" w:after="120"/>
       <w:outlineLvl w:val="0"/>
     </w:pPr>
     <w:rPr>
-      <w:rFonts w:asciiTheme="majorHAnsi" w:eastAsiaTheme="majorEastAsia" w:hAnsiTheme="majorHAnsi" w:cstheme="majorBidi"/>
+      <w:rFonts w:asciiTheme="majorHAnsi" w:eastAsiaTheme="majorEastAsia" w:hAnsiTheme="majorHAnsi" w:cstheme="majorBidi" w:ascii="Calibri" w:hAnsi="Calibri"/>
       <w:b/>
       <w:bCs/>
-      <w:color w:val="365F91" w:themeColor="accent1" w:themeShade="BF"/>
+      <w:color w:val="1A3C6E"/>
       <w:sz w:val="28"/>
       <w:szCs w:val="28"/>
     </w:rPr>
@@ -2788,15 +3186,15 @@
     <w:pPr>
       <w:keepNext/>
       <w:keepLines/>
-      <w:spacing w:before="200" w:after="0"/>
+      <w:spacing w:before="160" w:after="80"/>
       <w:outlineLvl w:val="1"/>
     </w:pPr>
     <w:rPr>
-      <w:rFonts w:asciiTheme="majorHAnsi" w:eastAsiaTheme="majorEastAsia" w:hAnsiTheme="majorHAnsi" w:cstheme="majorBidi"/>
+      <w:rFonts w:asciiTheme="majorHAnsi" w:eastAsiaTheme="majorEastAsia" w:hAnsiTheme="majorHAnsi" w:cstheme="majorBidi" w:ascii="Calibri" w:hAnsi="Calibri"/>
       <w:b/>
       <w:bCs/>
-      <w:color w:val="4F81BD" w:themeColor="accent1"/>
-      <w:sz w:val="26"/>
+      <w:color w:val="1A3C6E"/>
+      <w:sz w:val="22"/>
       <w:szCs w:val="26"/>
     </w:rPr>
   </w:style>
@@ -2816,10 +3214,11 @@
       <w:outlineLvl w:val="2"/>
     </w:pPr>
     <w:rPr>
-      <w:rFonts w:asciiTheme="majorHAnsi" w:eastAsiaTheme="majorEastAsia" w:hAnsiTheme="majorHAnsi" w:cstheme="majorBidi"/>
+      <w:rFonts w:asciiTheme="majorHAnsi" w:eastAsiaTheme="majorEastAsia" w:hAnsiTheme="majorHAnsi" w:cstheme="majorBidi" w:ascii="Calibri" w:hAnsi="Calibri"/>
       <w:b/>
       <w:bCs/>
-      <w:color w:val="4F81BD" w:themeColor="accent1"/>
+      <w:color w:val="1A3C6E"/>
+      <w:sz w:val="21"/>
     </w:rPr>
   </w:style>
   <w:style w:type="paragraph" w:styleId="Heading4">

</xml_diff>

<commit_message>
remove mermaid code, add pdf
</commit_message>
<xml_diff>
--- a/docs/REPORT.docx
+++ b/docs/REPORT.docx
@@ -1733,50 +1733,6 @@
     </w:p>
     <w:p>
       <w:pPr>
-        <w:spacing w:after="120"/>
-        <w:jc w:val="left"/>
-      </w:pPr>
-      <w:r>
-        <w:rPr>
-          <w:b/>
-          <w:i w:val="0"/>
-          <w:sz w:val="18"/>
-        </w:rPr>
-        <w:t>Mermaid diagram (for docs/DESIGN.md):</w:t>
-      </w:r>
-    </w:p>
-    <w:p>
-      <w:pPr>
-        <w:spacing w:after="80" w:before="40"/>
-        <w:shd w:fill="F2F2F2"/>
-      </w:pPr>
-      <w:r>
-        <w:rPr>
-          <w:rFonts w:ascii="Consolas" w:hAnsi="Consolas"/>
-          <w:color w:val="333333"/>
-          <w:sz w:val="17"/>
-        </w:rPr>
-        <w:t>graph TD</w:t>
-        <w:br/>
-        <w:t xml:space="preserve">  A[Main CLI] --&gt; B[AuthService]</w:t>
-        <w:br/>
-        <w:t xml:space="preserve">  A --&gt; C[BookService]</w:t>
-        <w:br/>
-        <w:t xml:space="preserve">  A --&gt; D[IssueService]</w:t>
-        <w:br/>
-        <w:t xml:space="preserve">  A --&gt; E[ReportService]</w:t>
-        <w:br/>
-        <w:t xml:space="preserve">  B --&gt; F[UserStore]</w:t>
-        <w:br/>
-        <w:t xml:space="preserve">  C --&gt; G[BookStore]</w:t>
-        <w:br/>
-        <w:t xml:space="preserve">  D --&gt; G</w:t>
-        <w:br/>
-        <w:t xml:space="preserve">  D --&gt; H[IssueStore]</w:t>
-      </w:r>
-    </w:p>
-    <w:p>
-      <w:pPr>
         <w:jc w:val="center"/>
       </w:pPr>
       <w:r>
@@ -1857,30 +1813,6 @@
     </w:p>
     <w:p>
       <w:pPr>
-        <w:spacing w:after="80" w:before="40"/>
-        <w:shd w:fill="F2F2F2"/>
-      </w:pPr>
-      <w:r>
-        <w:rPr>
-          <w:rFonts w:ascii="Consolas" w:hAnsi="Consolas"/>
-          <w:color w:val="333333"/>
-          <w:sz w:val="17"/>
-        </w:rPr>
-        <w:t>flowchart TD</w:t>
-        <w:br/>
-        <w:t xml:space="preserve">  Start --&gt; Login</w:t>
-        <w:br/>
-        <w:t xml:space="preserve">  Login --&gt; Check{Login ok?}</w:t>
-        <w:br/>
-        <w:t xml:space="preserve">  Check -- Yes --&gt; Role{Role?}</w:t>
-        <w:br/>
-        <w:t xml:space="preserve">  Role -- Admin --&gt; Manage Books/Members/Reports</w:t>
-        <w:br/>
-        <w:t xml:space="preserve">  Role -- Member --&gt; Browse/Issue/Return</w:t>
-      </w:r>
-    </w:p>
-    <w:p>
-      <w:pPr>
         <w:jc w:val="center"/>
       </w:pPr>
       <w:r>
@@ -2041,26 +1973,6 @@
     </w:p>
     <w:p>
       <w:pPr>
-        <w:spacing w:after="80" w:before="40"/>
-        <w:shd w:fill="F2F2F2"/>
-      </w:pPr>
-      <w:r>
-        <w:rPr>
-          <w:rFonts w:ascii="Consolas" w:hAnsi="Consolas"/>
-          <w:color w:val="333333"/>
-          <w:sz w:val="17"/>
-        </w:rPr>
-        <w:t>classDiagram</w:t>
-        <w:br/>
-        <w:t xml:space="preserve">  class User { String id; String username; String password; Role role; }</w:t>
-        <w:br/>
-        <w:t xml:space="preserve">  class Book { String id; String title; int total; int available; }</w:t>
-        <w:br/>
-        <w:t xml:space="preserve">  class Issue { String id; String bookId; String username; LocalDate due; }</w:t>
-      </w:r>
-    </w:p>
-    <w:p>
-      <w:pPr>
         <w:jc w:val="center"/>
       </w:pPr>
       <w:r>
@@ -2127,30 +2039,6 @@
     </w:p>
     <w:p>
       <w:pPr>
-        <w:spacing w:after="80" w:before="40"/>
-        <w:shd w:fill="F2F2F2"/>
-      </w:pPr>
-      <w:r>
-        <w:rPr>
-          <w:rFonts w:ascii="Consolas" w:hAnsi="Consolas"/>
-          <w:color w:val="333333"/>
-          <w:sz w:val="17"/>
-        </w:rPr>
-        <w:t>sequenceDiagram</w:t>
-        <w:br/>
-        <w:t xml:space="preserve">  Main-&gt;&gt;AuthService: login(username, password)</w:t>
-        <w:br/>
-        <w:t xml:space="preserve">  AuthService-&gt;&gt;UserStore: findByUsername()</w:t>
-        <w:br/>
-        <w:t xml:space="preserve">  Main-&gt;&gt;IssueService: issueBook(user, bookId)</w:t>
-        <w:br/>
-        <w:t xml:space="preserve">  IssueService-&gt;&gt;BookStore: findById()</w:t>
-        <w:br/>
-        <w:t xml:space="preserve">  IssueService-&gt;&gt;IssueStore: add()</w:t>
-      </w:r>
-    </w:p>
-    <w:p>
-      <w:pPr>
         <w:jc w:val="center"/>
       </w:pPr>
       <w:r>
@@ -2240,24 +2128,6 @@
           <w:sz w:val="22"/>
         </w:rPr>
         <w:t>ER Diagram</w:t>
-      </w:r>
-    </w:p>
-    <w:p>
-      <w:pPr>
-        <w:spacing w:after="80" w:before="40"/>
-        <w:shd w:fill="F2F2F2"/>
-      </w:pPr>
-      <w:r>
-        <w:rPr>
-          <w:rFonts w:ascii="Consolas" w:hAnsi="Consolas"/>
-          <w:color w:val="333333"/>
-          <w:sz w:val="17"/>
-        </w:rPr>
-        <w:t>erDiagram</w:t>
-        <w:br/>
-        <w:t xml:space="preserve">  USER ||--o{ ISSUE : has</w:t>
-        <w:br/>
-        <w:t xml:space="preserve">  BOOK ||--o{ ISSUE : issued_as</w:t>
       </w:r>
     </w:p>
     <w:p>

</xml_diff>

<commit_message>
update program to cse cybersec and school scai
</commit_message>
<xml_diff>
--- a/docs/REPORT.docx
+++ b/docs/REPORT.docx
@@ -289,14 +289,11 @@
             <w:tcW w:type="dxa" w:w="3600"/>
           </w:tcPr>
           <w:p>
-            <w:pPr>
-              <w:jc w:val="left"/>
-            </w:pPr>
             <w:r>
               <w:rPr>
-                <w:sz w:val="20"/>
+                <w:b w:val="0"/>
               </w:rPr>
-              <w:t>B.Tech CSE</w:t>
+              <w:t>B.Tech CSE (Cybersecurity)</w:t>
             </w:r>
           </w:p>
         </w:tc>
@@ -324,14 +321,8 @@
             <w:tcW w:type="dxa" w:w="3600"/>
           </w:tcPr>
           <w:p>
-            <w:pPr>
-              <w:jc w:val="left"/>
-            </w:pPr>
             <w:r>
-              <w:rPr>
-                <w:sz w:val="20"/>
-              </w:rPr>
-              <w:t>School of Computer Science</w:t>
+              <w:t>SCAI - School of Computer Science and Artificial Intelligence</w:t>
             </w:r>
           </w:p>
         </w:tc>
@@ -2914,10 +2905,10 @@
     </w:pPr>
     <w:r>
       <w:rPr>
-        <w:color w:val="888888"/>
+        <w:i/>
         <w:sz w:val="16"/>
       </w:rPr>
-      <w:t>CSE2006 - Programming in Java | Mayank Kushwaha - 24BCY10147 | VIT Bhopal</w:t>
+      <w:t>CSE2006 - Programming in Java | B.Tech CSE (Cybersecurity) | SCAI - VIT Bhopal | Mayank Kushwaha - 24BCY10147</w:t>
     </w:r>
   </w:p>
 </w:ftr>

</xml_diff>